<commit_message>
saya baru sampe login.php
</commit_message>
<xml_diff>
--- a/Perencanaan Project UKK RPL - SALWA.docx
+++ b/Perencanaan Project UKK RPL - SALWA.docx
@@ -1,6 +1,6 @@
 
 <file path=word/document.xml><?xml version="1.0" encoding="utf-8"?>
-<w:document xmlns:wpc="http://schemas.microsoft.com/office/word/2010/wordprocessingCanvas" xmlns:cx="http://schemas.microsoft.com/office/drawing/2014/chartex" xmlns:cx1="http://schemas.microsoft.com/office/drawing/2015/9/8/chartex" xmlns:cx2="http://schemas.microsoft.com/office/drawing/2015/10/21/chartex" xmlns:cx3="http://schemas.microsoft.com/office/drawing/2016/5/9/chartex" xmlns:cx4="http://schemas.microsoft.com/office/drawing/2016/5/10/chartex" xmlns:cx5="http://schemas.microsoft.com/office/drawing/2016/5/11/chartex" xmlns:cx6="http://schemas.microsoft.com/office/drawing/2016/5/12/chartex" xmlns:cx7="http://schemas.microsoft.com/office/drawing/2016/5/13/chartex" xmlns:cx8="http://schemas.microsoft.com/office/drawing/2016/5/14/chartex" xmlns:mc="http://schemas.openxmlformats.org/markup-compatibility/2006" xmlns:aink="http://schemas.microsoft.com/office/drawing/2016/ink" xmlns:am3d="http://schemas.microsoft.com/office/drawing/2017/model3d" xmlns:o="urn:schemas-microsoft-com:office:office" xmlns:oel="http://schemas.microsoft.com/office/2019/extlst" xmlns:r="http://schemas.openxmlformats.org/officeDocument/2006/relationships" xmlns:m="http://schemas.openxmlformats.org/officeDocument/2006/math" xmlns:v="urn:schemas-microsoft-com:vml" xmlns:wp14="http://schemas.microsoft.com/office/word/2010/wordprocessingDrawing" xmlns:wp="http://schemas.openxmlformats.org/drawingml/2006/wordprocessingDrawing" xmlns:w10="urn:schemas-microsoft-com:office:word" xmlns:w="http://schemas.openxmlformats.org/wordprocessingml/2006/main" xmlns:w14="http://schemas.microsoft.com/office/word/2010/wordml" xmlns:w15="http://schemas.microsoft.com/office/word/2012/wordml" xmlns:w16cex="http://schemas.microsoft.com/office/word/2018/wordml/cex" xmlns:w16cid="http://schemas.microsoft.com/office/word/2016/wordml/cid" xmlns:w16="http://schemas.microsoft.com/office/word/2018/wordml" xmlns:w16du="http://schemas.microsoft.com/office/word/2023/wordml/word16du" xmlns:w16sdtdh="http://schemas.microsoft.com/office/word/2020/wordml/sdtdatahash" xmlns:w16sdtfl="http://schemas.microsoft.com/office/word/2024/wordml/sdtformatlock" xmlns:w16se="http://schemas.microsoft.com/office/word/2015/wordml/symex" xmlns:wpg="http://schemas.microsoft.com/office/word/2010/wordprocessingGroup" xmlns:wpi="http://schemas.microsoft.com/office/word/2010/wordprocessingInk" xmlns:wne="http://schemas.microsoft.com/office/word/2006/wordml" xmlns:wps="http://schemas.microsoft.com/office/word/2010/wordprocessingShape" mc:Ignorable="w14 w15 w16se w16cid w16 w16cex w16sdtdh w16sdtfl w16du wp14">
+<w:document xmlns:wpc="http://schemas.microsoft.com/office/word/2010/wordprocessingCanvas" xmlns:cx="http://schemas.microsoft.com/office/drawing/2014/chartex" xmlns:cx1="http://schemas.microsoft.com/office/drawing/2015/9/8/chartex" xmlns:cx2="http://schemas.microsoft.com/office/drawing/2015/10/21/chartex" xmlns:cx3="http://schemas.microsoft.com/office/drawing/2016/5/9/chartex" xmlns:cx4="http://schemas.microsoft.com/office/drawing/2016/5/10/chartex" xmlns:cx5="http://schemas.microsoft.com/office/drawing/2016/5/11/chartex" xmlns:cx6="http://schemas.microsoft.com/office/drawing/2016/5/12/chartex" xmlns:cx7="http://schemas.microsoft.com/office/drawing/2016/5/13/chartex" xmlns:cx8="http://schemas.microsoft.com/office/drawing/2016/5/14/chartex" xmlns:mc="http://schemas.openxmlformats.org/markup-compatibility/2006" xmlns:aink="http://schemas.microsoft.com/office/drawing/2016/ink" xmlns:am3d="http://schemas.microsoft.com/office/drawing/2017/model3d" xmlns:o="urn:schemas-microsoft-com:office:office" xmlns:r="http://schemas.openxmlformats.org/officeDocument/2006/relationships" xmlns:m="http://schemas.openxmlformats.org/officeDocument/2006/math" xmlns:v="urn:schemas-microsoft-com:vml" xmlns:wp14="http://schemas.microsoft.com/office/word/2010/wordprocessingDrawing" xmlns:wp="http://schemas.openxmlformats.org/drawingml/2006/wordprocessingDrawing" xmlns:w10="urn:schemas-microsoft-com:office:word" xmlns:w="http://schemas.openxmlformats.org/wordprocessingml/2006/main" xmlns:w14="http://schemas.microsoft.com/office/word/2010/wordml" xmlns:w15="http://schemas.microsoft.com/office/word/2012/wordml" xmlns:w16cex="http://schemas.microsoft.com/office/word/2018/wordml/cex" xmlns:w16cid="http://schemas.microsoft.com/office/word/2016/wordml/cid" xmlns:w16="http://schemas.microsoft.com/office/word/2018/wordml" xmlns:w16se="http://schemas.microsoft.com/office/word/2015/wordml/symex" xmlns:wpg="http://schemas.microsoft.com/office/word/2010/wordprocessingGroup" xmlns:wpi="http://schemas.microsoft.com/office/word/2010/wordprocessingInk" xmlns:wne="http://schemas.microsoft.com/office/word/2006/wordml" xmlns:wps="http://schemas.microsoft.com/office/word/2010/wordprocessingShape" mc:Ignorable="w14 w15 w16se w16cid w16 w16cex wp14">
   <w:body>
     <w:p>
       <w:pPr>
@@ -211,8 +211,13 @@
             <w:pPr>
               <w:spacing w:after="60"/>
             </w:pPr>
-            <w:r>
-              <w:t xml:space="preserve">Salwa </w:t>
+            <w:proofErr w:type="spellStart"/>
+            <w:r>
+              <w:t>Salwa</w:t>
+            </w:r>
+            <w:proofErr w:type="spellEnd"/>
+            <w:r>
+              <w:t xml:space="preserve"> </w:t>
             </w:r>
             <w:proofErr w:type="spellStart"/>
             <w:r>
@@ -696,7 +701,25 @@
           <w:sz w:val="20"/>
           <w:szCs w:val="20"/>
         </w:rPr>
-        <w:t xml:space="preserve"> 2 (dua) </w:t>
+        <w:t xml:space="preserve"> 2 (</w:t>
+      </w:r>
+      <w:proofErr w:type="spellStart"/>
+      <w:r>
+        <w:rPr>
+          <w:color w:val="000000"/>
+          <w:sz w:val="20"/>
+          <w:szCs w:val="20"/>
+        </w:rPr>
+        <w:t>dua</w:t>
+      </w:r>
+      <w:proofErr w:type="spellEnd"/>
+      <w:r>
+        <w:rPr>
+          <w:color w:val="000000"/>
+          <w:sz w:val="20"/>
+          <w:szCs w:val="20"/>
+        </w:rPr>
+        <w:t xml:space="preserve">) </w:t>
       </w:r>
       <w:proofErr w:type="spellStart"/>
       <w:r>
@@ -1047,6 +1070,7 @@
           <w:docPartUnique/>
         </w:docPartObj>
       </w:sdtPr>
+      <w:sdtEndPr/>
       <w:sdtContent>
         <w:p>
           <w:r>
@@ -1476,8 +1500,13 @@
             <w:pPr>
               <w:spacing w:after="60"/>
             </w:pPr>
-            <w:r>
-              <w:t xml:space="preserve">Salwa </w:t>
+            <w:proofErr w:type="spellStart"/>
+            <w:r>
+              <w:t>Salwa</w:t>
+            </w:r>
+            <w:proofErr w:type="spellEnd"/>
+            <w:r>
+              <w:t xml:space="preserve"> </w:t>
             </w:r>
             <w:proofErr w:type="spellStart"/>
             <w:r>
@@ -2322,7 +2351,25 @@
           <w:sz w:val="20"/>
           <w:szCs w:val="20"/>
         </w:rPr>
-        <w:t xml:space="preserve">. Bagian </w:t>
+        <w:t xml:space="preserve">. </w:t>
+      </w:r>
+      <w:proofErr w:type="spellStart"/>
+      <w:r>
+        <w:rPr>
+          <w:color w:val="000000"/>
+          <w:sz w:val="20"/>
+          <w:szCs w:val="20"/>
+        </w:rPr>
+        <w:t>Bagian</w:t>
+      </w:r>
+      <w:proofErr w:type="spellEnd"/>
+      <w:r>
+        <w:rPr>
+          <w:color w:val="000000"/>
+          <w:sz w:val="20"/>
+          <w:szCs w:val="20"/>
+        </w:rPr>
+        <w:t xml:space="preserve"> </w:t>
       </w:r>
       <w:proofErr w:type="spellStart"/>
       <w:r>
@@ -2456,7 +2503,15 @@
         <w:pStyle w:val="Heading2"/>
       </w:pPr>
       <w:r>
-        <w:t xml:space="preserve">2.1 Latar </w:t>
+        <w:t xml:space="preserve">2.1 </w:t>
+      </w:r>
+      <w:proofErr w:type="spellStart"/>
+      <w:r>
+        <w:t>Latar</w:t>
+      </w:r>
+      <w:proofErr w:type="spellEnd"/>
+      <w:r>
+        <w:t xml:space="preserve"> </w:t>
       </w:r>
       <w:proofErr w:type="spellStart"/>
       <w:r>
@@ -2626,7 +2681,15 @@
             </w:r>
             <w:proofErr w:type="spellEnd"/>
             <w:r>
-              <w:t xml:space="preserve"> toko </w:t>
+              <w:t xml:space="preserve"> </w:t>
+            </w:r>
+            <w:proofErr w:type="spellStart"/>
+            <w:r>
+              <w:t>toko</w:t>
+            </w:r>
+            <w:proofErr w:type="spellEnd"/>
+            <w:r>
+              <w:t xml:space="preserve"> </w:t>
             </w:r>
             <w:proofErr w:type="spellStart"/>
             <w:r>
@@ -2903,7 +2966,15 @@
             </w:r>
             <w:proofErr w:type="spellEnd"/>
             <w:r>
-              <w:t xml:space="preserve">. Dengan </w:t>
+              <w:t xml:space="preserve">. </w:t>
+            </w:r>
+            <w:proofErr w:type="spellStart"/>
+            <w:r>
+              <w:t>Dengan</w:t>
+            </w:r>
+            <w:proofErr w:type="spellEnd"/>
+            <w:r>
+              <w:t xml:space="preserve"> </w:t>
             </w:r>
             <w:proofErr w:type="spellStart"/>
             <w:r>
@@ -3180,7 +3251,15 @@
             </w:r>
             <w:proofErr w:type="spellEnd"/>
             <w:r>
-              <w:t xml:space="preserve"> Lunak.</w:t>
+              <w:t xml:space="preserve"> </w:t>
+            </w:r>
+            <w:proofErr w:type="spellStart"/>
+            <w:r>
+              <w:t>Lunak</w:t>
+            </w:r>
+            <w:proofErr w:type="spellEnd"/>
+            <w:r>
+              <w:t>.</w:t>
             </w:r>
           </w:p>
           <w:p>
@@ -4772,8 +4851,13 @@
             <w:pPr>
               <w:spacing w:after="120"/>
             </w:pPr>
-            <w:r>
-              <w:t xml:space="preserve">Kasir / </w:t>
+            <w:proofErr w:type="spellStart"/>
+            <w:r>
+              <w:t>Kasir</w:t>
+            </w:r>
+            <w:proofErr w:type="spellEnd"/>
+            <w:r>
+              <w:t xml:space="preserve"> / </w:t>
             </w:r>
             <w:proofErr w:type="spellStart"/>
             <w:r>
@@ -4904,8 +4988,13 @@
             </w:r>
             <w:proofErr w:type="spellEnd"/>
             <w:r>
-              <w:t xml:space="preserve"> Toko</w:t>
-            </w:r>
+              <w:t xml:space="preserve"> </w:t>
+            </w:r>
+            <w:proofErr w:type="spellStart"/>
+            <w:r>
+              <w:t>Toko</w:t>
+            </w:r>
+            <w:proofErr w:type="spellEnd"/>
           </w:p>
         </w:tc>
         <w:tc>
@@ -5444,7 +5533,15 @@
             </w:r>
             <w:proofErr w:type="spellEnd"/>
             <w:r>
-              <w:t xml:space="preserve">, hapus, </w:t>
+              <w:t xml:space="preserve">, </w:t>
+            </w:r>
+            <w:proofErr w:type="spellStart"/>
+            <w:r>
+              <w:t>hapus</w:t>
+            </w:r>
+            <w:proofErr w:type="spellEnd"/>
+            <w:r>
+              <w:t xml:space="preserve">, </w:t>
             </w:r>
             <w:proofErr w:type="spellStart"/>
             <w:r>
@@ -5853,8 +5950,13 @@
             <w:pPr>
               <w:spacing w:after="120"/>
             </w:pPr>
-            <w:r>
-              <w:t xml:space="preserve">Kasir </w:t>
+            <w:proofErr w:type="spellStart"/>
+            <w:r>
+              <w:t>Kasir</w:t>
+            </w:r>
+            <w:proofErr w:type="spellEnd"/>
+            <w:r>
+              <w:t xml:space="preserve"> </w:t>
             </w:r>
             <w:proofErr w:type="spellStart"/>
             <w:r>
@@ -6866,8 +6968,13 @@
             <w:vAlign w:val="center"/>
           </w:tcPr>
           <w:p>
-            <w:r>
-              <w:t xml:space="preserve">Kode program </w:t>
+            <w:proofErr w:type="spellStart"/>
+            <w:r>
+              <w:t>Kode</w:t>
+            </w:r>
+            <w:proofErr w:type="spellEnd"/>
+            <w:r>
+              <w:t xml:space="preserve"> program </w:t>
             </w:r>
             <w:proofErr w:type="spellStart"/>
             <w:r>
@@ -7121,7 +7228,15 @@
             </w:r>
             <w:proofErr w:type="spellEnd"/>
             <w:r>
-              <w:t xml:space="preserve"> toko.</w:t>
+              <w:t xml:space="preserve"> </w:t>
+            </w:r>
+            <w:proofErr w:type="spellStart"/>
+            <w:r>
+              <w:t>toko</w:t>
+            </w:r>
+            <w:proofErr w:type="spellEnd"/>
+            <w:r>
+              <w:t>.</w:t>
             </w:r>
           </w:p>
         </w:tc>
@@ -7851,8 +7966,18 @@
                 <w:bCs/>
                 <w:color w:val="000000"/>
               </w:rPr>
-              <w:t xml:space="preserve"> Aktor</w:t>
-            </w:r>
+              <w:t xml:space="preserve"> </w:t>
+            </w:r>
+            <w:proofErr w:type="spellStart"/>
+            <w:r>
+              <w:rPr>
+                <w:b/>
+                <w:bCs/>
+                <w:color w:val="000000"/>
+              </w:rPr>
+              <w:t>Aktor</w:t>
+            </w:r>
+            <w:proofErr w:type="spellEnd"/>
           </w:p>
         </w:tc>
       </w:tr>
@@ -8107,8 +8232,13 @@
             </w:r>
             <w:proofErr w:type="spellEnd"/>
             <w:r>
-              <w:t xml:space="preserve"> / Kasir</w:t>
-            </w:r>
+              <w:t xml:space="preserve"> / </w:t>
+            </w:r>
+            <w:proofErr w:type="spellStart"/>
+            <w:r>
+              <w:t>Kasir</w:t>
+            </w:r>
+            <w:proofErr w:type="spellEnd"/>
           </w:p>
         </w:tc>
         <w:tc>
@@ -8297,8 +8427,13 @@
             </w:r>
             <w:proofErr w:type="spellEnd"/>
             <w:r>
-              <w:t xml:space="preserve"> Toko</w:t>
-            </w:r>
+              <w:t xml:space="preserve"> </w:t>
+            </w:r>
+            <w:proofErr w:type="spellStart"/>
+            <w:r>
+              <w:t>Toko</w:t>
+            </w:r>
+            <w:proofErr w:type="spellEnd"/>
           </w:p>
         </w:tc>
         <w:tc>
@@ -8525,21 +8660,31 @@
               <w:spacing w:after="120"/>
               <w:jc w:val="center"/>
             </w:pPr>
+            <w:proofErr w:type="spellStart"/>
             <w:r>
               <w:rPr>
                 <w:b/>
                 <w:bCs/>
                 <w:color w:val="000000"/>
               </w:rPr>
-              <w:t xml:space="preserve">Aktor </w:t>
-            </w:r>
-            <w:proofErr w:type="spellStart"/>
+              <w:t>Aktor</w:t>
+            </w:r>
+            <w:proofErr w:type="spellEnd"/>
             <w:r>
               <w:rPr>
                 <w:b/>
                 <w:bCs/>
                 <w:color w:val="000000"/>
               </w:rPr>
+              <w:t xml:space="preserve"> </w:t>
+            </w:r>
+            <w:proofErr w:type="spellStart"/>
+            <w:r>
+              <w:rPr>
+                <w:b/>
+                <w:bCs/>
+                <w:color w:val="000000"/>
+              </w:rPr>
               <w:t>Terkait</w:t>
             </w:r>
             <w:proofErr w:type="spellEnd"/>
@@ -9162,7 +9307,15 @@
             </w:r>
             <w:proofErr w:type="spellEnd"/>
             <w:r>
-              <w:t xml:space="preserve"> Riwayat </w:t>
+              <w:t xml:space="preserve"> </w:t>
+            </w:r>
+            <w:proofErr w:type="spellStart"/>
+            <w:r>
+              <w:t>Riwayat</w:t>
+            </w:r>
+            <w:proofErr w:type="spellEnd"/>
+            <w:r>
+              <w:t xml:space="preserve"> </w:t>
             </w:r>
             <w:proofErr w:type="spellStart"/>
             <w:r>
@@ -9193,7 +9346,15 @@
               <w:spacing w:after="120"/>
             </w:pPr>
             <w:r>
-              <w:t xml:space="preserve">Admin, Kasir, </w:t>
+              <w:t xml:space="preserve">Admin, </w:t>
+            </w:r>
+            <w:proofErr w:type="spellStart"/>
+            <w:r>
+              <w:t>Kasir</w:t>
+            </w:r>
+            <w:proofErr w:type="spellEnd"/>
+            <w:r>
+              <w:t xml:space="preserve">, </w:t>
             </w:r>
             <w:proofErr w:type="spellStart"/>
             <w:r>
@@ -9201,8 +9362,13 @@
             </w:r>
             <w:proofErr w:type="spellEnd"/>
             <w:r>
-              <w:t xml:space="preserve"> Toko</w:t>
-            </w:r>
+              <w:t xml:space="preserve"> </w:t>
+            </w:r>
+            <w:proofErr w:type="spellStart"/>
+            <w:r>
+              <w:t>Toko</w:t>
+            </w:r>
+            <w:proofErr w:type="spellEnd"/>
           </w:p>
         </w:tc>
       </w:tr>
@@ -9314,8 +9480,13 @@
             </w:r>
             <w:proofErr w:type="spellEnd"/>
             <w:r>
-              <w:t xml:space="preserve"> Toko</w:t>
-            </w:r>
+              <w:t xml:space="preserve"> </w:t>
+            </w:r>
+            <w:proofErr w:type="spellStart"/>
+            <w:r>
+              <w:t>Toko</w:t>
+            </w:r>
+            <w:proofErr w:type="spellEnd"/>
           </w:p>
         </w:tc>
       </w:tr>
@@ -9628,7 +9799,7 @@
                           </pic:cNvPicPr>
                         </pic:nvPicPr>
                         <pic:blipFill>
-                          <a:blip r:embed="rId8">
+                          <a:blip r:embed="rId9">
                             <a:extLst>
                               <a:ext uri="{28A0092B-C50C-407E-A947-70E740481C1C}">
                                 <a14:useLocalDpi xmlns:a14="http://schemas.microsoft.com/office/drawing/2010/main" val="0"/>
@@ -11114,7 +11285,15 @@
             </w:r>
             <w:proofErr w:type="spellEnd"/>
             <w:r>
-              <w:t xml:space="preserve"> nama </w:t>
+              <w:t xml:space="preserve"> </w:t>
+            </w:r>
+            <w:proofErr w:type="spellStart"/>
+            <w:r>
+              <w:t>nama</w:t>
+            </w:r>
+            <w:proofErr w:type="spellEnd"/>
+            <w:r>
+              <w:t xml:space="preserve"> </w:t>
             </w:r>
             <w:proofErr w:type="spellStart"/>
             <w:r>
@@ -11594,15 +11773,15 @@
             </w:r>
             <w:proofErr w:type="spellEnd"/>
             <w:r>
-              <w:t xml:space="preserve"> masing-masing. </w:t>
-            </w:r>
-            <w:proofErr w:type="spellStart"/>
-            <w:r>
-              <w:t>Setelah</w:t>
-            </w:r>
-            <w:proofErr w:type="spellEnd"/>
-            <w:r>
-              <w:t xml:space="preserve"> </w:t>
+              <w:t xml:space="preserve"> </w:t>
+            </w:r>
+            <w:proofErr w:type="spellStart"/>
+            <w:r>
+              <w:t>masing-masing</w:t>
+            </w:r>
+            <w:proofErr w:type="spellEnd"/>
+            <w:r>
+              <w:t xml:space="preserve">. Setelah </w:t>
             </w:r>
             <w:proofErr w:type="spellStart"/>
             <w:r>
@@ -11730,7 +11909,15 @@
             </w:r>
             <w:proofErr w:type="spellEnd"/>
             <w:r>
-              <w:t xml:space="preserve">. Kasir </w:t>
+              <w:t xml:space="preserve">. </w:t>
+            </w:r>
+            <w:proofErr w:type="spellStart"/>
+            <w:r>
+              <w:t>Kasir</w:t>
+            </w:r>
+            <w:proofErr w:type="spellEnd"/>
+            <w:r>
+              <w:t xml:space="preserve"> </w:t>
             </w:r>
             <w:proofErr w:type="spellStart"/>
             <w:r>
@@ -12233,7 +12420,7 @@
                           </pic:cNvPicPr>
                         </pic:nvPicPr>
                         <pic:blipFill>
-                          <a:blip r:embed="rId9">
+                          <a:blip r:embed="rId10">
                             <a:extLst>
                               <a:ext uri="{28A0092B-C50C-407E-A947-70E740481C1C}">
                                 <a14:useLocalDpi xmlns:a14="http://schemas.microsoft.com/office/drawing/2010/main" val="0"/>
@@ -12602,7 +12789,15 @@
             </w:r>
             <w:proofErr w:type="spellEnd"/>
             <w:r>
-              <w:t xml:space="preserve">. Jika data </w:t>
+              <w:t xml:space="preserve">. </w:t>
+            </w:r>
+            <w:proofErr w:type="spellStart"/>
+            <w:r>
+              <w:t>Jika</w:t>
+            </w:r>
+            <w:proofErr w:type="spellEnd"/>
+            <w:r>
+              <w:t xml:space="preserve"> data </w:t>
             </w:r>
             <w:proofErr w:type="spellStart"/>
             <w:r>
@@ -12658,7 +12853,15 @@
             </w:r>
             <w:proofErr w:type="spellEnd"/>
             <w:r>
-              <w:t xml:space="preserve">. Jika salah, </w:t>
+              <w:t xml:space="preserve">. </w:t>
+            </w:r>
+            <w:proofErr w:type="spellStart"/>
+            <w:r>
+              <w:t>Jika</w:t>
+            </w:r>
+            <w:proofErr w:type="spellEnd"/>
+            <w:r>
+              <w:t xml:space="preserve"> salah, </w:t>
             </w:r>
             <w:proofErr w:type="spellStart"/>
             <w:r>
@@ -12986,8 +13189,13 @@
               <w:spacing w:after="120"/>
               <w:jc w:val="both"/>
             </w:pPr>
-            <w:r>
-              <w:t xml:space="preserve">Kasir </w:t>
+            <w:proofErr w:type="spellStart"/>
+            <w:r>
+              <w:t>Kasir</w:t>
+            </w:r>
+            <w:proofErr w:type="spellEnd"/>
+            <w:r>
+              <w:t xml:space="preserve"> </w:t>
             </w:r>
             <w:proofErr w:type="spellStart"/>
             <w:r>
@@ -13075,15 +13283,7 @@
             </w:r>
             <w:proofErr w:type="spellEnd"/>
             <w:r>
-              <w:t xml:space="preserve">. </w:t>
-            </w:r>
-            <w:proofErr w:type="spellStart"/>
-            <w:r>
-              <w:t>Setelah</w:t>
-            </w:r>
-            <w:proofErr w:type="spellEnd"/>
-            <w:r>
-              <w:t xml:space="preserve"> </w:t>
+              <w:t xml:space="preserve">. Setelah </w:t>
             </w:r>
             <w:proofErr w:type="spellStart"/>
             <w:r>
@@ -13204,8 +13404,13 @@
             <w:pPr>
               <w:spacing w:after="120"/>
             </w:pPr>
-            <w:r>
-              <w:t xml:space="preserve">Riwayat </w:t>
+            <w:proofErr w:type="spellStart"/>
+            <w:r>
+              <w:t>Riwayat</w:t>
+            </w:r>
+            <w:proofErr w:type="spellEnd"/>
+            <w:r>
+              <w:t xml:space="preserve"> </w:t>
             </w:r>
             <w:proofErr w:type="spellStart"/>
             <w:r>
@@ -13298,7 +13503,15 @@
             </w:r>
             <w:proofErr w:type="spellEnd"/>
             <w:r>
-              <w:t xml:space="preserve"> toko </w:t>
+              <w:t xml:space="preserve"> </w:t>
+            </w:r>
+            <w:proofErr w:type="spellStart"/>
+            <w:r>
+              <w:t>toko</w:t>
+            </w:r>
+            <w:proofErr w:type="spellEnd"/>
+            <w:r>
+              <w:t xml:space="preserve"> </w:t>
             </w:r>
             <w:proofErr w:type="spellStart"/>
             <w:r>
@@ -13549,7 +13762,15 @@
             </w:r>
             <w:proofErr w:type="spellEnd"/>
             <w:r>
-              <w:t xml:space="preserve"> toko </w:t>
+              <w:t xml:space="preserve"> </w:t>
+            </w:r>
+            <w:proofErr w:type="spellStart"/>
+            <w:r>
+              <w:t>toko</w:t>
+            </w:r>
+            <w:proofErr w:type="spellEnd"/>
+            <w:r>
+              <w:t xml:space="preserve"> </w:t>
             </w:r>
             <w:proofErr w:type="spellStart"/>
             <w:r>
@@ -14600,7 +14821,7 @@
                           </pic:cNvPicPr>
                         </pic:nvPicPr>
                         <pic:blipFill>
-                          <a:blip r:embed="rId10">
+                          <a:blip r:embed="rId11">
                             <a:extLst>
                               <a:ext uri="{28A0092B-C50C-407E-A947-70E740481C1C}">
                                 <a14:useLocalDpi xmlns:a14="http://schemas.microsoft.com/office/drawing/2010/main" val="0"/>
@@ -14820,8 +15041,18 @@
                 <w:bCs/>
                 <w:color w:val="000000"/>
               </w:rPr>
-              <w:t xml:space="preserve"> Tabel</w:t>
-            </w:r>
+              <w:t xml:space="preserve"> </w:t>
+            </w:r>
+            <w:proofErr w:type="spellStart"/>
+            <w:r>
+              <w:rPr>
+                <w:b/>
+                <w:bCs/>
+                <w:color w:val="000000"/>
+              </w:rPr>
+              <w:t>Tabel</w:t>
+            </w:r>
+            <w:proofErr w:type="spellEnd"/>
           </w:p>
         </w:tc>
       </w:tr>
@@ -15445,8 +15676,13 @@
       </w:r>
       <w:proofErr w:type="spellEnd"/>
       <w:r>
-        <w:t xml:space="preserve"> Tabel</w:t>
-      </w:r>
+        <w:t xml:space="preserve"> </w:t>
+      </w:r>
+      <w:proofErr w:type="spellStart"/>
+      <w:r>
+        <w:t>Tabel</w:t>
+      </w:r>
+      <w:proofErr w:type="spellEnd"/>
     </w:p>
     <w:p>
       <w:pPr>
@@ -15458,7 +15694,25 @@
           <w:bCs/>
           <w:color w:val="000000"/>
         </w:rPr>
-        <w:t xml:space="preserve">Nama Tabel: </w:t>
+        <w:t xml:space="preserve">Nama </w:t>
+      </w:r>
+      <w:proofErr w:type="spellStart"/>
+      <w:r>
+        <w:rPr>
+          <w:b/>
+          <w:bCs/>
+          <w:color w:val="000000"/>
+        </w:rPr>
+        <w:t>Tabel</w:t>
+      </w:r>
+      <w:proofErr w:type="spellEnd"/>
+      <w:r>
+        <w:rPr>
+          <w:b/>
+          <w:bCs/>
+          <w:color w:val="000000"/>
+        </w:rPr>
+        <w:t xml:space="preserve">: </w:t>
       </w:r>
       <w:r>
         <w:rPr>
@@ -16643,13 +16897,23 @@
           <w:szCs w:val="20"/>
         </w:rPr>
       </w:pPr>
+      <w:proofErr w:type="spellStart"/>
       <w:r>
         <w:rPr>
           <w:color w:val="000000"/>
           <w:sz w:val="20"/>
           <w:szCs w:val="20"/>
         </w:rPr>
-        <w:t xml:space="preserve">Salin </w:t>
+        <w:t>Salin</w:t>
+      </w:r>
+      <w:proofErr w:type="spellEnd"/>
+      <w:r>
+        <w:rPr>
+          <w:color w:val="000000"/>
+          <w:sz w:val="20"/>
+          <w:szCs w:val="20"/>
+        </w:rPr>
+        <w:t xml:space="preserve"> </w:t>
       </w:r>
       <w:proofErr w:type="spellStart"/>
       <w:r>
@@ -16770,13 +17034,45 @@
           <w:bCs/>
           <w:color w:val="000000"/>
         </w:rPr>
-        <w:t xml:space="preserve">Nama Tabel: </w:t>
+        <w:t xml:space="preserve">Nama </w:t>
+      </w:r>
+      <w:proofErr w:type="spellStart"/>
+      <w:r>
+        <w:rPr>
+          <w:b/>
+          <w:bCs/>
+          <w:color w:val="000000"/>
+        </w:rPr>
+        <w:t>Tabel</w:t>
+      </w:r>
+      <w:proofErr w:type="spellEnd"/>
+      <w:r>
+        <w:rPr>
+          <w:b/>
+          <w:bCs/>
+          <w:color w:val="000000"/>
+        </w:rPr>
+        <w:t xml:space="preserve">: </w:t>
       </w:r>
       <w:r>
         <w:rPr>
           <w:color w:val="000000"/>
         </w:rPr>
-        <w:t xml:space="preserve">[Tabel </w:t>
+        <w:t>[</w:t>
+      </w:r>
+      <w:proofErr w:type="spellStart"/>
+      <w:r>
+        <w:rPr>
+          <w:color w:val="000000"/>
+        </w:rPr>
+        <w:t>Tabel</w:t>
+      </w:r>
+      <w:proofErr w:type="spellEnd"/>
+      <w:r>
+        <w:rPr>
+          <w:color w:val="000000"/>
+        </w:rPr>
+        <w:t xml:space="preserve"> </w:t>
       </w:r>
       <w:proofErr w:type="spellStart"/>
       <w:r>
@@ -17654,8 +17950,13 @@
             <w:pPr>
               <w:spacing w:after="120"/>
             </w:pPr>
-            <w:r>
-              <w:t xml:space="preserve">Harga </w:t>
+            <w:proofErr w:type="spellStart"/>
+            <w:r>
+              <w:t>Harga</w:t>
+            </w:r>
+            <w:proofErr w:type="spellEnd"/>
+            <w:r>
+              <w:t xml:space="preserve"> </w:t>
             </w:r>
             <w:proofErr w:type="spellStart"/>
             <w:r>
@@ -17953,8 +18254,13 @@
             <w:pPr>
               <w:spacing w:after="120"/>
             </w:pPr>
-            <w:r>
-              <w:t xml:space="preserve">Foto </w:t>
+            <w:proofErr w:type="spellStart"/>
+            <w:r>
+              <w:t>Foto</w:t>
+            </w:r>
+            <w:proofErr w:type="spellEnd"/>
+            <w:r>
+              <w:t xml:space="preserve"> </w:t>
             </w:r>
             <w:proofErr w:type="spellStart"/>
             <w:r>
@@ -19037,13 +19343,45 @@
           <w:bCs/>
           <w:color w:val="000000"/>
         </w:rPr>
-        <w:t xml:space="preserve">Nama Tabel: </w:t>
+        <w:t xml:space="preserve">Nama </w:t>
+      </w:r>
+      <w:proofErr w:type="spellStart"/>
+      <w:r>
+        <w:rPr>
+          <w:b/>
+          <w:bCs/>
+          <w:color w:val="000000"/>
+        </w:rPr>
+        <w:t>Tabel</w:t>
+      </w:r>
+      <w:proofErr w:type="spellEnd"/>
+      <w:r>
+        <w:rPr>
+          <w:b/>
+          <w:bCs/>
+          <w:color w:val="000000"/>
+        </w:rPr>
+        <w:t xml:space="preserve">: </w:t>
       </w:r>
       <w:r>
         <w:rPr>
           <w:color w:val="000000"/>
         </w:rPr>
-        <w:t xml:space="preserve">[Tabel </w:t>
+        <w:t>[</w:t>
+      </w:r>
+      <w:proofErr w:type="spellStart"/>
+      <w:r>
+        <w:rPr>
+          <w:color w:val="000000"/>
+        </w:rPr>
+        <w:t>Tabel</w:t>
+      </w:r>
+      <w:proofErr w:type="spellEnd"/>
+      <w:r>
+        <w:rPr>
+          <w:color w:val="000000"/>
+        </w:rPr>
+        <w:t xml:space="preserve"> </w:t>
       </w:r>
       <w:proofErr w:type="spellStart"/>
       <w:r>
@@ -20284,13 +20622,45 @@
           <w:bCs/>
           <w:color w:val="000000"/>
         </w:rPr>
-        <w:t xml:space="preserve">Nama Tabel: </w:t>
+        <w:t xml:space="preserve">Nama </w:t>
+      </w:r>
+      <w:proofErr w:type="spellStart"/>
+      <w:r>
+        <w:rPr>
+          <w:b/>
+          <w:bCs/>
+          <w:color w:val="000000"/>
+        </w:rPr>
+        <w:t>Tabel</w:t>
+      </w:r>
+      <w:proofErr w:type="spellEnd"/>
+      <w:r>
+        <w:rPr>
+          <w:b/>
+          <w:bCs/>
+          <w:color w:val="000000"/>
+        </w:rPr>
+        <w:t xml:space="preserve">: </w:t>
       </w:r>
       <w:r>
         <w:rPr>
           <w:color w:val="000000"/>
         </w:rPr>
-        <w:t xml:space="preserve">[Tabel </w:t>
+        <w:t>[</w:t>
+      </w:r>
+      <w:proofErr w:type="spellStart"/>
+      <w:r>
+        <w:rPr>
+          <w:color w:val="000000"/>
+        </w:rPr>
+        <w:t>Tabel</w:t>
+      </w:r>
+      <w:proofErr w:type="spellEnd"/>
+      <w:r>
+        <w:rPr>
+          <w:color w:val="000000"/>
+        </w:rPr>
+        <w:t xml:space="preserve"> </w:t>
       </w:r>
       <w:proofErr w:type="spellStart"/>
       <w:r>
@@ -21230,8 +21600,13 @@
             <w:pPr>
               <w:spacing w:after="120"/>
             </w:pPr>
-            <w:r>
-              <w:t xml:space="preserve">Harga </w:t>
+            <w:proofErr w:type="spellStart"/>
+            <w:r>
+              <w:t>Harga</w:t>
+            </w:r>
+            <w:proofErr w:type="spellEnd"/>
+            <w:r>
+              <w:t xml:space="preserve"> </w:t>
             </w:r>
             <w:proofErr w:type="spellStart"/>
             <w:r>
@@ -21393,8 +21768,13 @@
             </w:r>
             <w:proofErr w:type="spellEnd"/>
             <w:r>
-              <w:t xml:space="preserve"> × Harga</w:t>
-            </w:r>
+              <w:t xml:space="preserve"> × </w:t>
+            </w:r>
+            <w:proofErr w:type="spellStart"/>
+            <w:r>
+              <w:t>Harga</w:t>
+            </w:r>
+            <w:proofErr w:type="spellEnd"/>
           </w:p>
         </w:tc>
       </w:tr>
@@ -21417,8 +21797,21 @@
       </w:r>
       <w:proofErr w:type="spellEnd"/>
       <w:r>
-        <w:t xml:space="preserve"> Antar Tabel</w:t>
-      </w:r>
+        <w:t xml:space="preserve"> </w:t>
+      </w:r>
+      <w:proofErr w:type="spellStart"/>
+      <w:r>
+        <w:t>Antar</w:t>
+      </w:r>
+      <w:proofErr w:type="spellEnd"/>
+      <w:r>
+        <w:t xml:space="preserve"> </w:t>
+      </w:r>
+      <w:proofErr w:type="spellStart"/>
+      <w:r>
+        <w:t>Tabel</w:t>
+      </w:r>
+      <w:proofErr w:type="spellEnd"/>
     </w:p>
     <w:tbl>
       <w:tblPr>
@@ -21631,8 +22024,18 @@
                 <w:bCs/>
                 <w:color w:val="000000"/>
               </w:rPr>
-              <w:t xml:space="preserve"> Tabel</w:t>
-            </w:r>
+              <w:t xml:space="preserve"> </w:t>
+            </w:r>
+            <w:proofErr w:type="spellStart"/>
+            <w:r>
+              <w:rPr>
+                <w:b/>
+                <w:bCs/>
+                <w:color w:val="000000"/>
+              </w:rPr>
+              <w:t>Tabel</w:t>
+            </w:r>
+            <w:proofErr w:type="spellEnd"/>
           </w:p>
         </w:tc>
       </w:tr>
@@ -23255,25 +23658,7 @@
                 <w:sz w:val="24"/>
                 <w:szCs w:val="24"/>
               </w:rPr>
-              <w:t xml:space="preserve"> (hierarchical navigation). </w:t>
-            </w:r>
-            <w:proofErr w:type="spellStart"/>
-            <w:r>
-              <w:rPr>
-                <w:rFonts w:ascii="Times New Roman" w:eastAsia="Times New Roman" w:hAnsi="Times New Roman" w:cs="Times New Roman"/>
-                <w:sz w:val="24"/>
-                <w:szCs w:val="24"/>
-              </w:rPr>
-              <w:t>Setelah</w:t>
-            </w:r>
-            <w:proofErr w:type="spellEnd"/>
-            <w:r>
-              <w:rPr>
-                <w:rFonts w:ascii="Times New Roman" w:eastAsia="Times New Roman" w:hAnsi="Times New Roman" w:cs="Times New Roman"/>
-                <w:sz w:val="24"/>
-                <w:szCs w:val="24"/>
-              </w:rPr>
-              <w:t xml:space="preserve"> </w:t>
+              <w:t xml:space="preserve"> (hierarchical navigation). Setelah </w:t>
             </w:r>
             <w:proofErr w:type="spellStart"/>
             <w:r>
@@ -23671,13 +24056,23 @@
                 <w:szCs w:val="24"/>
               </w:rPr>
             </w:pPr>
+            <w:proofErr w:type="spellStart"/>
             <w:r>
               <w:rPr>
                 <w:rFonts w:ascii="Times New Roman" w:eastAsia="Times New Roman" w:hAnsi="Times New Roman" w:cs="Times New Roman"/>
                 <w:sz w:val="24"/>
                 <w:szCs w:val="24"/>
               </w:rPr>
-              <w:t>Kasir/</w:t>
+              <w:t>Kasir</w:t>
+            </w:r>
+            <w:proofErr w:type="spellEnd"/>
+            <w:r>
+              <w:rPr>
+                <w:rFonts w:ascii="Times New Roman" w:eastAsia="Times New Roman" w:hAnsi="Times New Roman" w:cs="Times New Roman"/>
+                <w:sz w:val="24"/>
+                <w:szCs w:val="24"/>
+              </w:rPr>
+              <w:t>/</w:t>
             </w:r>
             <w:proofErr w:type="spellStart"/>
             <w:r>
@@ -23853,7 +24248,25 @@
                 <w:sz w:val="24"/>
                 <w:szCs w:val="24"/>
               </w:rPr>
-              <w:t xml:space="preserve"> Toko </w:t>
+              <w:t xml:space="preserve"> </w:t>
+            </w:r>
+            <w:proofErr w:type="spellStart"/>
+            <w:r>
+              <w:rPr>
+                <w:rFonts w:ascii="Times New Roman" w:eastAsia="Times New Roman" w:hAnsi="Times New Roman" w:cs="Times New Roman"/>
+                <w:sz w:val="24"/>
+                <w:szCs w:val="24"/>
+              </w:rPr>
+              <w:t>Toko</w:t>
+            </w:r>
+            <w:proofErr w:type="spellEnd"/>
+            <w:r>
+              <w:rPr>
+                <w:rFonts w:ascii="Times New Roman" w:eastAsia="Times New Roman" w:hAnsi="Times New Roman" w:cs="Times New Roman"/>
+                <w:sz w:val="24"/>
+                <w:szCs w:val="24"/>
+              </w:rPr>
+              <w:t xml:space="preserve"> </w:t>
             </w:r>
             <w:proofErr w:type="spellStart"/>
             <w:r>
@@ -24135,7 +24548,7 @@
                           </pic:cNvPicPr>
                         </pic:nvPicPr>
                         <pic:blipFill>
-                          <a:blip r:embed="rId11">
+                          <a:blip r:embed="rId12">
                             <a:extLst>
                               <a:ext uri="{28A0092B-C50C-407E-A947-70E740481C1C}">
                                 <a14:useLocalDpi xmlns:a14="http://schemas.microsoft.com/office/drawing/2010/main" val="0"/>
@@ -24363,58 +24776,78 @@
                 <w:bCs/>
                 <w:color w:val="000000"/>
               </w:rPr>
-              <w:t xml:space="preserve"> Halaman</w:t>
-            </w:r>
-          </w:p>
-        </w:tc>
-        <w:tc>
-          <w:tcPr>
-            <w:tcW w:w="2840" w:type="dxa"/>
-            <w:tcBorders>
-              <w:top w:val="single" w:sz="4" w:space="0" w:color="000000"/>
-              <w:left w:val="single" w:sz="4" w:space="0" w:color="000000"/>
-              <w:bottom w:val="single" w:sz="4" w:space="0" w:color="000000"/>
-              <w:right w:val="single" w:sz="4" w:space="0" w:color="000000"/>
-            </w:tcBorders>
-            <w:tcMar>
-              <w:top w:w="100" w:type="dxa"/>
-              <w:left w:w="120" w:type="dxa"/>
-              <w:bottom w:w="100" w:type="dxa"/>
-              <w:right w:w="120" w:type="dxa"/>
-            </w:tcMar>
-            <w:vAlign w:val="center"/>
-          </w:tcPr>
-          <w:p>
-            <w:pPr>
-              <w:spacing w:after="120"/>
-              <w:jc w:val="center"/>
-            </w:pPr>
+              <w:t xml:space="preserve"> </w:t>
+            </w:r>
+            <w:proofErr w:type="spellStart"/>
             <w:r>
               <w:rPr>
                 <w:b/>
                 <w:bCs/>
                 <w:color w:val="000000"/>
               </w:rPr>
-              <w:t xml:space="preserve">Alur </w:t>
-            </w:r>
-            <w:proofErr w:type="spellStart"/>
+              <w:t>Halaman</w:t>
+            </w:r>
+            <w:proofErr w:type="spellEnd"/>
+          </w:p>
+        </w:tc>
+        <w:tc>
+          <w:tcPr>
+            <w:tcW w:w="2840" w:type="dxa"/>
+            <w:tcBorders>
+              <w:top w:val="single" w:sz="4" w:space="0" w:color="000000"/>
+              <w:left w:val="single" w:sz="4" w:space="0" w:color="000000"/>
+              <w:bottom w:val="single" w:sz="4" w:space="0" w:color="000000"/>
+              <w:right w:val="single" w:sz="4" w:space="0" w:color="000000"/>
+            </w:tcBorders>
+            <w:tcMar>
+              <w:top w:w="100" w:type="dxa"/>
+              <w:left w:w="120" w:type="dxa"/>
+              <w:bottom w:w="100" w:type="dxa"/>
+              <w:right w:w="120" w:type="dxa"/>
+            </w:tcMar>
+            <w:vAlign w:val="center"/>
+          </w:tcPr>
+          <w:p>
+            <w:pPr>
+              <w:spacing w:after="120"/>
+              <w:jc w:val="center"/>
+            </w:pPr>
             <w:r>
               <w:rPr>
                 <w:b/>
                 <w:bCs/>
                 <w:color w:val="000000"/>
               </w:rPr>
-              <w:t>Perpindahan</w:t>
-            </w:r>
-            <w:proofErr w:type="spellEnd"/>
+              <w:t xml:space="preserve">Alur </w:t>
+            </w:r>
+            <w:proofErr w:type="spellStart"/>
             <w:r>
               <w:rPr>
                 <w:b/>
                 <w:bCs/>
                 <w:color w:val="000000"/>
               </w:rPr>
-              <w:t xml:space="preserve"> Halaman</w:t>
-            </w:r>
+              <w:t>Perpindahan</w:t>
+            </w:r>
+            <w:proofErr w:type="spellEnd"/>
+            <w:r>
+              <w:rPr>
+                <w:b/>
+                <w:bCs/>
+                <w:color w:val="000000"/>
+              </w:rPr>
+              <w:t xml:space="preserve"> </w:t>
+            </w:r>
+            <w:proofErr w:type="spellStart"/>
+            <w:r>
+              <w:rPr>
+                <w:b/>
+                <w:bCs/>
+                <w:color w:val="000000"/>
+              </w:rPr>
+              <w:t>Halaman</w:t>
+            </w:r>
+            <w:proofErr w:type="spellEnd"/>
           </w:p>
         </w:tc>
       </w:tr>
@@ -24496,8 +24929,13 @@
             <w:pPr>
               <w:spacing w:after="120"/>
             </w:pPr>
-            <w:r>
-              <w:t xml:space="preserve">Halaman </w:t>
+            <w:proofErr w:type="spellStart"/>
+            <w:r>
+              <w:t>Halaman</w:t>
+            </w:r>
+            <w:proofErr w:type="spellEnd"/>
+            <w:r>
+              <w:t xml:space="preserve"> </w:t>
             </w:r>
             <w:proofErr w:type="spellStart"/>
             <w:r>
@@ -24923,7 +25361,15 @@
             </w:r>
             <w:proofErr w:type="spellEnd"/>
             <w:r>
-              <w:t xml:space="preserve">/Edit/Hapus </w:t>
+              <w:t>/Edit/</w:t>
+            </w:r>
+            <w:proofErr w:type="spellStart"/>
+            <w:r>
+              <w:t>Hapus</w:t>
+            </w:r>
+            <w:proofErr w:type="spellEnd"/>
+            <w:r>
+              <w:t xml:space="preserve"> </w:t>
             </w:r>
             <w:proofErr w:type="spellStart"/>
             <w:r>
@@ -25471,7 +25917,15 @@
             </w:r>
             <w:proofErr w:type="spellEnd"/>
             <w:r>
-              <w:t xml:space="preserve"> Laporan.</w:t>
+              <w:t xml:space="preserve"> </w:t>
+            </w:r>
+            <w:proofErr w:type="spellStart"/>
+            <w:r>
+              <w:t>Laporan</w:t>
+            </w:r>
+            <w:proofErr w:type="spellEnd"/>
+            <w:r>
+              <w:t>.</w:t>
             </w:r>
           </w:p>
         </w:tc>
@@ -25776,8 +26230,13 @@
       </w:r>
       <w:proofErr w:type="spellEnd"/>
       <w:r>
-        <w:t xml:space="preserve"> Desain</w:t>
-      </w:r>
+        <w:t xml:space="preserve"> </w:t>
+      </w:r>
+      <w:proofErr w:type="spellStart"/>
+      <w:r>
+        <w:t>Desain</w:t>
+      </w:r>
+      <w:proofErr w:type="spellEnd"/>
     </w:p>
     <w:tbl>
       <w:tblPr>
@@ -25876,7 +26335,15 @@
             </w:r>
             <w:proofErr w:type="spellEnd"/>
             <w:r>
-              <w:t xml:space="preserve"> Modern Minimalist Dashboard. Desain </w:t>
+              <w:t xml:space="preserve"> Modern Minimalist Dashboard. </w:t>
+            </w:r>
+            <w:proofErr w:type="spellStart"/>
+            <w:r>
+              <w:t>Desain</w:t>
+            </w:r>
+            <w:proofErr w:type="spellEnd"/>
+            <w:r>
+              <w:t xml:space="preserve"> </w:t>
             </w:r>
             <w:proofErr w:type="spellStart"/>
             <w:r>
@@ -25932,7 +26399,15 @@
             </w:r>
             <w:proofErr w:type="spellEnd"/>
             <w:r>
-              <w:t xml:space="preserve">. Warna </w:t>
+              <w:t xml:space="preserve">. </w:t>
+            </w:r>
+            <w:proofErr w:type="spellStart"/>
+            <w:r>
+              <w:t>Warna</w:t>
+            </w:r>
+            <w:proofErr w:type="spellEnd"/>
+            <w:r>
+              <w:t xml:space="preserve"> </w:t>
             </w:r>
             <w:proofErr w:type="spellStart"/>
             <w:r>
@@ -26582,7 +27057,15 @@
               <w:spacing w:after="120"/>
             </w:pPr>
             <w:r>
-              <w:t xml:space="preserve">Subjudul, nama menu, dan </w:t>
+              <w:t xml:space="preserve">Subjudul, </w:t>
+            </w:r>
+            <w:proofErr w:type="spellStart"/>
+            <w:r>
+              <w:t>nama</w:t>
+            </w:r>
+            <w:proofErr w:type="spellEnd"/>
+            <w:r>
+              <w:t xml:space="preserve"> menu, dan </w:t>
             </w:r>
             <w:proofErr w:type="spellStart"/>
             <w:r>
@@ -27403,8 +27886,13 @@
             <w:pPr>
               <w:spacing w:after="120"/>
             </w:pPr>
-            <w:r>
-              <w:t xml:space="preserve">Latar </w:t>
+            <w:proofErr w:type="spellStart"/>
+            <w:r>
+              <w:t>Latar</w:t>
+            </w:r>
+            <w:proofErr w:type="spellEnd"/>
+            <w:r>
+              <w:t xml:space="preserve"> </w:t>
             </w:r>
             <w:proofErr w:type="spellStart"/>
             <w:r>
@@ -27529,8 +28017,13 @@
             <w:pPr>
               <w:spacing w:after="120"/>
             </w:pPr>
-            <w:r>
-              <w:t xml:space="preserve">Teks </w:t>
+            <w:proofErr w:type="spellStart"/>
+            <w:r>
+              <w:t>Teks</w:t>
+            </w:r>
+            <w:proofErr w:type="spellEnd"/>
+            <w:r>
+              <w:t xml:space="preserve"> </w:t>
             </w:r>
             <w:proofErr w:type="spellStart"/>
             <w:r>
@@ -27811,7 +28304,15 @@
             </w:r>
             <w:proofErr w:type="spellEnd"/>
             <w:r>
-              <w:t>, Edit, Hapus, dan Filter.</w:t>
+              <w:t xml:space="preserve">, Edit, </w:t>
+            </w:r>
+            <w:proofErr w:type="spellStart"/>
+            <w:r>
+              <w:t>Hapus</w:t>
+            </w:r>
+            <w:proofErr w:type="spellEnd"/>
+            <w:r>
+              <w:t>, dan Filter.</w:t>
             </w:r>
           </w:p>
         </w:tc>
@@ -27894,8 +28395,13 @@
             <w:pPr>
               <w:spacing w:after="120"/>
             </w:pPr>
-            <w:r>
-              <w:t xml:space="preserve">Kolom input </w:t>
+            <w:proofErr w:type="spellStart"/>
+            <w:r>
+              <w:t>Kolom</w:t>
+            </w:r>
+            <w:proofErr w:type="spellEnd"/>
+            <w:r>
+              <w:t xml:space="preserve"> input </w:t>
             </w:r>
             <w:proofErr w:type="spellStart"/>
             <w:r>
@@ -28353,16 +28859,29 @@
       </w:pPr>
       <w:r>
         <w:lastRenderedPageBreak/>
-        <w:t xml:space="preserve">7.5 Desain </w:t>
+        <w:t xml:space="preserve">7.5 </w:t>
       </w:r>
       <w:proofErr w:type="spellStart"/>
       <w:r>
+        <w:t>Desain</w:t>
+      </w:r>
+      <w:proofErr w:type="spellEnd"/>
+      <w:r>
+        <w:t xml:space="preserve"> </w:t>
+      </w:r>
+      <w:proofErr w:type="spellStart"/>
+      <w:r>
         <w:t>Setiap</w:t>
       </w:r>
       <w:proofErr w:type="spellEnd"/>
       <w:r>
-        <w:t xml:space="preserve"> Halaman</w:t>
-      </w:r>
+        <w:t xml:space="preserve"> </w:t>
+      </w:r>
+      <w:proofErr w:type="spellStart"/>
+      <w:r>
+        <w:t>Halaman</w:t>
+      </w:r>
+      <w:proofErr w:type="spellEnd"/>
     </w:p>
     <w:tbl>
       <w:tblPr>
@@ -28433,7 +28952,25 @@
                 <w:bCs/>
                 <w:color w:val="000000"/>
               </w:rPr>
-              <w:t xml:space="preserve"> UI Design Halaman di </w:t>
+              <w:t xml:space="preserve"> UI Design </w:t>
+            </w:r>
+            <w:proofErr w:type="spellStart"/>
+            <w:r>
+              <w:rPr>
+                <w:b/>
+                <w:bCs/>
+                <w:color w:val="000000"/>
+              </w:rPr>
+              <w:t>Halaman</w:t>
+            </w:r>
+            <w:proofErr w:type="spellEnd"/>
+            <w:r>
+              <w:rPr>
+                <w:b/>
+                <w:bCs/>
+                <w:color w:val="000000"/>
+              </w:rPr>
+              <w:t xml:space="preserve"> di </w:t>
             </w:r>
             <w:proofErr w:type="spellStart"/>
             <w:r>
@@ -28480,7 +29017,7 @@
                           </pic:cNvPicPr>
                         </pic:nvPicPr>
                         <pic:blipFill>
-                          <a:blip r:embed="rId12">
+                          <a:blip r:embed="rId13">
                             <a:extLst>
                               <a:ext uri="{28A0092B-C50C-407E-A947-70E740481C1C}">
                                 <a14:useLocalDpi xmlns:a14="http://schemas.microsoft.com/office/drawing/2010/main" val="0"/>
@@ -28579,6 +29116,7 @@
       <w:pPr>
         <w:spacing w:after="160"/>
       </w:pPr>
+      <w:proofErr w:type="spellStart"/>
       <w:r>
         <w:rPr>
           <w:color w:val="000000"/>
@@ -28586,7 +29124,16 @@
           <w:szCs w:val="20"/>
         </w:rPr>
         <w:lastRenderedPageBreak/>
-        <w:t xml:space="preserve">Salin area di </w:t>
+        <w:t>Salin</w:t>
+      </w:r>
+      <w:proofErr w:type="spellEnd"/>
+      <w:r>
+        <w:rPr>
+          <w:color w:val="000000"/>
+          <w:sz w:val="20"/>
+          <w:szCs w:val="20"/>
+        </w:rPr>
+        <w:t xml:space="preserve"> area di </w:t>
       </w:r>
       <w:proofErr w:type="spellStart"/>
       <w:r>
@@ -28879,7 +29426,15 @@
             </w:r>
             <w:proofErr w:type="spellEnd"/>
             <w:r>
-              <w:t xml:space="preserve">. Dengan </w:t>
+              <w:t xml:space="preserve">. </w:t>
+            </w:r>
+            <w:proofErr w:type="spellStart"/>
+            <w:r>
+              <w:t>Dengan</w:t>
+            </w:r>
+            <w:proofErr w:type="spellEnd"/>
+            <w:r>
+              <w:t xml:space="preserve"> </w:t>
             </w:r>
             <w:proofErr w:type="spellStart"/>
             <w:r>
@@ -29911,6 +30466,7 @@
         <w:pStyle w:val="Heading2"/>
       </w:pPr>
       <w:r>
+        <w:lastRenderedPageBreak/>
         <w:t xml:space="preserve">8.2 </w:t>
       </w:r>
       <w:proofErr w:type="spellStart"/>
@@ -29968,175 +30524,441 @@
           </w:tcPr>
           <w:p>
             <w:pPr>
-              <w:spacing w:after="60"/>
-            </w:pPr>
-            <w:proofErr w:type="spellStart"/>
-            <w:r>
-              <w:t>Struktur</w:t>
-            </w:r>
-            <w:proofErr w:type="spellEnd"/>
-            <w:r>
-              <w:t xml:space="preserve"> folder pada </w:t>
-            </w:r>
-            <w:proofErr w:type="spellStart"/>
-            <w:r>
-              <w:t>aplikasi</w:t>
-            </w:r>
-            <w:proofErr w:type="spellEnd"/>
-            <w:r>
-              <w:t xml:space="preserve"> </w:t>
-            </w:r>
-            <w:proofErr w:type="spellStart"/>
-            <w:r>
-              <w:t>SellPoint</w:t>
-            </w:r>
-            <w:proofErr w:type="spellEnd"/>
-            <w:r>
-              <w:t xml:space="preserve"> </w:t>
-            </w:r>
-            <w:proofErr w:type="spellStart"/>
-            <w:r>
-              <w:t>dibuat</w:t>
-            </w:r>
-            <w:proofErr w:type="spellEnd"/>
-            <w:r>
-              <w:t xml:space="preserve"> </w:t>
-            </w:r>
-            <w:proofErr w:type="spellStart"/>
-            <w:r>
-              <w:t>terpisah</w:t>
-            </w:r>
-            <w:proofErr w:type="spellEnd"/>
-            <w:r>
-              <w:t xml:space="preserve"> agar </w:t>
-            </w:r>
-            <w:proofErr w:type="spellStart"/>
-            <w:r>
-              <w:t>kode</w:t>
-            </w:r>
-            <w:proofErr w:type="spellEnd"/>
-            <w:r>
-              <w:t xml:space="preserve"> </w:t>
-            </w:r>
-            <w:proofErr w:type="spellStart"/>
-            <w:r>
-              <w:t>lebih</w:t>
-            </w:r>
-            <w:proofErr w:type="spellEnd"/>
-            <w:r>
-              <w:t xml:space="preserve"> </w:t>
-            </w:r>
-            <w:proofErr w:type="spellStart"/>
-            <w:r>
-              <w:t>rapi</w:t>
-            </w:r>
-            <w:proofErr w:type="spellEnd"/>
-            <w:r>
-              <w:t xml:space="preserve">, </w:t>
-            </w:r>
-            <w:proofErr w:type="spellStart"/>
-            <w:r>
-              <w:t>mudah</w:t>
-            </w:r>
-            <w:proofErr w:type="spellEnd"/>
-            <w:r>
-              <w:t xml:space="preserve"> </w:t>
-            </w:r>
-            <w:proofErr w:type="spellStart"/>
-            <w:r>
-              <w:t>dipelajari</w:t>
-            </w:r>
-            <w:proofErr w:type="spellEnd"/>
-            <w:r>
-              <w:t xml:space="preserve">, dan </w:t>
-            </w:r>
-            <w:proofErr w:type="spellStart"/>
-            <w:r>
-              <w:t>mudah</w:t>
-            </w:r>
-            <w:proofErr w:type="spellEnd"/>
-            <w:r>
-              <w:t xml:space="preserve"> </w:t>
-            </w:r>
-            <w:proofErr w:type="spellStart"/>
-            <w:r>
-              <w:t>dikembangkan</w:t>
-            </w:r>
-            <w:proofErr w:type="spellEnd"/>
-            <w:r>
-              <w:t xml:space="preserve">. </w:t>
-            </w:r>
-            <w:proofErr w:type="spellStart"/>
-            <w:r>
-              <w:t>Setiap</w:t>
-            </w:r>
-            <w:proofErr w:type="spellEnd"/>
-            <w:r>
-              <w:t xml:space="preserve"> folder </w:t>
-            </w:r>
-            <w:proofErr w:type="spellStart"/>
-            <w:r>
-              <w:t>memiliki</w:t>
-            </w:r>
-            <w:proofErr w:type="spellEnd"/>
-            <w:r>
-              <w:t xml:space="preserve"> </w:t>
-            </w:r>
-            <w:proofErr w:type="spellStart"/>
-            <w:r>
-              <w:t>fungsi</w:t>
-            </w:r>
-            <w:proofErr w:type="spellEnd"/>
-            <w:r>
-              <w:t xml:space="preserve"> yang </w:t>
-            </w:r>
-            <w:proofErr w:type="spellStart"/>
-            <w:r>
-              <w:t>berbeda</w:t>
-            </w:r>
-            <w:proofErr w:type="spellEnd"/>
-            <w:r>
-              <w:t xml:space="preserve"> </w:t>
-            </w:r>
-            <w:proofErr w:type="spellStart"/>
-            <w:r>
-              <w:t>sesuai</w:t>
-            </w:r>
-            <w:proofErr w:type="spellEnd"/>
-            <w:r>
-              <w:t xml:space="preserve"> </w:t>
-            </w:r>
-            <w:proofErr w:type="spellStart"/>
-            <w:r>
-              <w:t>kebutuhan</w:t>
-            </w:r>
-            <w:proofErr w:type="spellEnd"/>
-            <w:r>
-              <w:t xml:space="preserve"> </w:t>
-            </w:r>
-            <w:proofErr w:type="spellStart"/>
-            <w:r>
-              <w:t>aplikasi</w:t>
-            </w:r>
-            <w:proofErr w:type="spellEnd"/>
-            <w:r>
-              <w:t xml:space="preserve"> PHP Native.</w:t>
-            </w:r>
-          </w:p>
-          <w:p>
-            <w:pPr>
-              <w:spacing w:after="120"/>
-            </w:pPr>
-          </w:p>
-          <w:p>
-            <w:pPr>
-              <w:spacing w:after="120"/>
-            </w:pPr>
-          </w:p>
-          <w:p>
-            <w:pPr>
-              <w:spacing w:after="120"/>
-            </w:pPr>
+              <w:spacing w:after="120"/>
+            </w:pPr>
+            <w:proofErr w:type="spellStart"/>
+            <w:r>
+              <w:lastRenderedPageBreak/>
+              <w:t>sellpoint</w:t>
+            </w:r>
+            <w:proofErr w:type="spellEnd"/>
+            <w:r>
+              <w:t>/</w:t>
+            </w:r>
+          </w:p>
+          <w:p>
+            <w:pPr>
+              <w:spacing w:after="120"/>
+            </w:pPr>
+            <w:r>
+              <w:t>│</w:t>
+            </w:r>
+          </w:p>
+          <w:p>
+            <w:pPr>
+              <w:spacing w:after="120"/>
+            </w:pPr>
+            <w:r>
+              <w:t>├── assets/</w:t>
+            </w:r>
+          </w:p>
+          <w:p>
+            <w:pPr>
+              <w:spacing w:after="120"/>
+            </w:pPr>
+            <w:r>
+              <w:t xml:space="preserve">│   ├── </w:t>
+            </w:r>
+            <w:proofErr w:type="spellStart"/>
+            <w:r>
+              <w:t>css</w:t>
+            </w:r>
+            <w:proofErr w:type="spellEnd"/>
+            <w:r>
+              <w:t>/</w:t>
+            </w:r>
+          </w:p>
+          <w:p>
+            <w:pPr>
+              <w:spacing w:after="120"/>
+            </w:pPr>
+            <w:r>
+              <w:t xml:space="preserve">│   ├── </w:t>
+            </w:r>
+            <w:proofErr w:type="spellStart"/>
+            <w:r>
+              <w:t>js</w:t>
+            </w:r>
+            <w:proofErr w:type="spellEnd"/>
+            <w:r>
+              <w:t>/</w:t>
+            </w:r>
+          </w:p>
+          <w:p>
+            <w:pPr>
+              <w:spacing w:after="120"/>
+            </w:pPr>
+            <w:r>
+              <w:t xml:space="preserve">│   └── </w:t>
+            </w:r>
+            <w:proofErr w:type="spellStart"/>
+            <w:r>
+              <w:t>img</w:t>
+            </w:r>
+            <w:proofErr w:type="spellEnd"/>
+            <w:r>
+              <w:t>/</w:t>
+            </w:r>
+          </w:p>
+          <w:p>
+            <w:pPr>
+              <w:spacing w:after="120"/>
+            </w:pPr>
+            <w:r>
+              <w:t>│</w:t>
+            </w:r>
+          </w:p>
+          <w:p>
+            <w:pPr>
+              <w:spacing w:after="120"/>
+            </w:pPr>
+            <w:r>
+              <w:t>├── config/</w:t>
+            </w:r>
+          </w:p>
+          <w:p>
+            <w:pPr>
+              <w:spacing w:after="120"/>
+            </w:pPr>
+            <w:r>
+              <w:t xml:space="preserve">│   └── </w:t>
+            </w:r>
+            <w:proofErr w:type="spellStart"/>
+            <w:r>
+              <w:t>koneksi.php</w:t>
+            </w:r>
+            <w:proofErr w:type="spellEnd"/>
+          </w:p>
+          <w:p>
+            <w:pPr>
+              <w:spacing w:after="120"/>
+            </w:pPr>
+            <w:r>
+              <w:t>│</w:t>
+            </w:r>
+          </w:p>
+          <w:p>
+            <w:pPr>
+              <w:spacing w:after="120"/>
+            </w:pPr>
+            <w:r>
+              <w:t xml:space="preserve">├── </w:t>
+            </w:r>
+            <w:proofErr w:type="spellStart"/>
+            <w:r>
+              <w:t>produk</w:t>
+            </w:r>
+            <w:proofErr w:type="spellEnd"/>
+            <w:r>
+              <w:t>/</w:t>
+            </w:r>
+          </w:p>
+          <w:p>
+            <w:pPr>
+              <w:spacing w:after="120"/>
+            </w:pPr>
+            <w:r>
+              <w:t xml:space="preserve">│   ├── </w:t>
+            </w:r>
+            <w:proofErr w:type="spellStart"/>
+            <w:r>
+              <w:t>index.php</w:t>
+            </w:r>
+            <w:proofErr w:type="spellEnd"/>
+          </w:p>
+          <w:p>
+            <w:pPr>
+              <w:spacing w:after="120"/>
+            </w:pPr>
+            <w:r>
+              <w:t xml:space="preserve">│   ├── </w:t>
+            </w:r>
+            <w:proofErr w:type="spellStart"/>
+            <w:r>
+              <w:t>tambah.php</w:t>
+            </w:r>
+            <w:proofErr w:type="spellEnd"/>
+          </w:p>
+          <w:p>
+            <w:pPr>
+              <w:spacing w:after="120"/>
+            </w:pPr>
+            <w:r>
+              <w:t xml:space="preserve">│   ├── </w:t>
+            </w:r>
+            <w:proofErr w:type="spellStart"/>
+            <w:r>
+              <w:t>edit.php</w:t>
+            </w:r>
+            <w:proofErr w:type="spellEnd"/>
+          </w:p>
+          <w:p>
+            <w:pPr>
+              <w:spacing w:after="120"/>
+            </w:pPr>
+            <w:r>
+              <w:t xml:space="preserve">│   └── </w:t>
+            </w:r>
+            <w:proofErr w:type="spellStart"/>
+            <w:r>
+              <w:t>hapus.php</w:t>
+            </w:r>
+            <w:proofErr w:type="spellEnd"/>
+          </w:p>
+          <w:p>
+            <w:pPr>
+              <w:spacing w:after="120"/>
+            </w:pPr>
+            <w:r>
+              <w:t>│</w:t>
+            </w:r>
+          </w:p>
+          <w:p>
+            <w:pPr>
+              <w:spacing w:after="120"/>
+            </w:pPr>
+            <w:r>
+              <w:t xml:space="preserve">├── </w:t>
+            </w:r>
+            <w:proofErr w:type="spellStart"/>
+            <w:r>
+              <w:t>pelanggan</w:t>
+            </w:r>
+            <w:proofErr w:type="spellEnd"/>
+            <w:r>
+              <w:t>/</w:t>
+            </w:r>
+          </w:p>
+          <w:p>
+            <w:pPr>
+              <w:spacing w:after="120"/>
+            </w:pPr>
+            <w:r>
+              <w:t xml:space="preserve">│   ├── </w:t>
+            </w:r>
+            <w:proofErr w:type="spellStart"/>
+            <w:r>
+              <w:t>index.php</w:t>
+            </w:r>
+            <w:proofErr w:type="spellEnd"/>
+          </w:p>
+          <w:p>
+            <w:pPr>
+              <w:spacing w:after="120"/>
+            </w:pPr>
+            <w:r>
+              <w:t xml:space="preserve">│   ├── </w:t>
+            </w:r>
+            <w:proofErr w:type="spellStart"/>
+            <w:r>
+              <w:t>tambah.php</w:t>
+            </w:r>
+            <w:proofErr w:type="spellEnd"/>
+          </w:p>
+          <w:p>
+            <w:pPr>
+              <w:spacing w:after="120"/>
+            </w:pPr>
+            <w:r>
+              <w:t xml:space="preserve">│   ├── </w:t>
+            </w:r>
+            <w:proofErr w:type="spellStart"/>
+            <w:r>
+              <w:t>edit.php</w:t>
+            </w:r>
+            <w:proofErr w:type="spellEnd"/>
+          </w:p>
+          <w:p>
+            <w:pPr>
+              <w:spacing w:after="120"/>
+            </w:pPr>
+            <w:r>
+              <w:t xml:space="preserve">│   └── </w:t>
+            </w:r>
+            <w:proofErr w:type="spellStart"/>
+            <w:r>
+              <w:t>hapus.php</w:t>
+            </w:r>
+            <w:proofErr w:type="spellEnd"/>
+          </w:p>
+          <w:p>
+            <w:pPr>
+              <w:spacing w:after="120"/>
+            </w:pPr>
+            <w:r>
+              <w:t>│</w:t>
+            </w:r>
+          </w:p>
+          <w:p>
+            <w:pPr>
+              <w:spacing w:after="120"/>
+            </w:pPr>
+            <w:r>
+              <w:t xml:space="preserve">├── </w:t>
+            </w:r>
+            <w:proofErr w:type="spellStart"/>
+            <w:r>
+              <w:t>transaksi</w:t>
+            </w:r>
+            <w:proofErr w:type="spellEnd"/>
+            <w:r>
+              <w:t>/</w:t>
+            </w:r>
+          </w:p>
+          <w:p>
+            <w:pPr>
+              <w:spacing w:after="120"/>
+            </w:pPr>
+            <w:r>
+              <w:t xml:space="preserve">│   ├── </w:t>
+            </w:r>
+            <w:proofErr w:type="spellStart"/>
+            <w:r>
+              <w:t>index.php</w:t>
+            </w:r>
+            <w:proofErr w:type="spellEnd"/>
+          </w:p>
+          <w:p>
+            <w:pPr>
+              <w:spacing w:after="120"/>
+            </w:pPr>
+            <w:r>
+              <w:t xml:space="preserve">│   └── </w:t>
+            </w:r>
+            <w:proofErr w:type="spellStart"/>
+            <w:r>
+              <w:t>simpan.php</w:t>
+            </w:r>
+            <w:proofErr w:type="spellEnd"/>
+          </w:p>
+          <w:p>
+            <w:pPr>
+              <w:spacing w:after="120"/>
+            </w:pPr>
+            <w:r>
+              <w:t>│</w:t>
+            </w:r>
+          </w:p>
+          <w:p>
+            <w:pPr>
+              <w:spacing w:after="120"/>
+            </w:pPr>
+            <w:r>
+              <w:t xml:space="preserve">├── </w:t>
+            </w:r>
+            <w:proofErr w:type="spellStart"/>
+            <w:r>
+              <w:t>laporan</w:t>
+            </w:r>
+            <w:proofErr w:type="spellEnd"/>
+            <w:r>
+              <w:t>/</w:t>
+            </w:r>
+          </w:p>
+          <w:p>
+            <w:pPr>
+              <w:spacing w:after="120"/>
+            </w:pPr>
+            <w:r>
+              <w:t xml:space="preserve">│   └── </w:t>
+            </w:r>
+            <w:proofErr w:type="spellStart"/>
+            <w:r>
+              <w:t>index.php</w:t>
+            </w:r>
+            <w:proofErr w:type="spellEnd"/>
+          </w:p>
+          <w:p>
+            <w:pPr>
+              <w:spacing w:after="120"/>
+            </w:pPr>
+            <w:r>
+              <w:t>│</w:t>
+            </w:r>
+          </w:p>
+          <w:p>
+            <w:pPr>
+              <w:spacing w:after="120"/>
+            </w:pPr>
+            <w:r>
+              <w:t>├── users/</w:t>
+            </w:r>
+          </w:p>
+          <w:p>
+            <w:pPr>
+              <w:spacing w:after="120"/>
+            </w:pPr>
+            <w:r>
+              <w:t xml:space="preserve">│   └── </w:t>
+            </w:r>
+            <w:proofErr w:type="spellStart"/>
+            <w:r>
+              <w:t>index.php</w:t>
+            </w:r>
+            <w:proofErr w:type="spellEnd"/>
+          </w:p>
+          <w:p>
+            <w:pPr>
+              <w:spacing w:after="120"/>
+            </w:pPr>
+            <w:r>
+              <w:t>│</w:t>
+            </w:r>
+          </w:p>
+          <w:p>
+            <w:pPr>
+              <w:spacing w:after="120"/>
+            </w:pPr>
+            <w:r>
+              <w:t xml:space="preserve">├── </w:t>
+            </w:r>
+            <w:proofErr w:type="spellStart"/>
+            <w:r>
+              <w:t>login.php</w:t>
+            </w:r>
+            <w:proofErr w:type="spellEnd"/>
+          </w:p>
+          <w:p>
+            <w:pPr>
+              <w:spacing w:after="120"/>
+            </w:pPr>
+            <w:r>
+              <w:lastRenderedPageBreak/>
+              <w:t xml:space="preserve">├── </w:t>
+            </w:r>
+            <w:proofErr w:type="spellStart"/>
+            <w:r>
+              <w:t>logout.php</w:t>
+            </w:r>
+            <w:proofErr w:type="spellEnd"/>
+          </w:p>
+          <w:p>
+            <w:pPr>
+              <w:spacing w:after="120"/>
+            </w:pPr>
+            <w:r>
+              <w:t xml:space="preserve">├── </w:t>
+            </w:r>
+            <w:proofErr w:type="spellStart"/>
+            <w:r>
+              <w:t>dashboard.php</w:t>
+            </w:r>
+            <w:proofErr w:type="spellEnd"/>
+          </w:p>
+          <w:p>
+            <w:pPr>
+              <w:spacing w:after="120"/>
+            </w:pPr>
+            <w:r>
+              <w:t xml:space="preserve">└── </w:t>
+            </w:r>
+            <w:proofErr w:type="spellStart"/>
+            <w:r>
+              <w:t>index.php</w:t>
+            </w:r>
+            <w:bookmarkStart w:id="0" w:name="_GoBack"/>
+            <w:bookmarkEnd w:id="0"/>
+            <w:proofErr w:type="spellEnd"/>
           </w:p>
         </w:tc>
       </w:tr>
@@ -30146,7 +30968,16 @@
         <w:pStyle w:val="Heading2"/>
       </w:pPr>
       <w:r>
-        <w:t xml:space="preserve">8.3 Daftar Fitur dan </w:t>
+        <w:lastRenderedPageBreak/>
+        <w:t xml:space="preserve">8.3 Daftar </w:t>
+      </w:r>
+      <w:proofErr w:type="spellStart"/>
+      <w:r>
+        <w:t>Fitur</w:t>
+      </w:r>
+      <w:proofErr w:type="spellEnd"/>
+      <w:r>
+        <w:t xml:space="preserve"> dan </w:t>
       </w:r>
       <w:proofErr w:type="spellStart"/>
       <w:r>
@@ -30290,32 +31121,8 @@
                 <w:bCs/>
                 <w:color w:val="000000"/>
               </w:rPr>
-              <w:t xml:space="preserve"> Fitur</w:t>
-            </w:r>
-          </w:p>
-        </w:tc>
-        <w:tc>
-          <w:tcPr>
-            <w:tcW w:w="1989" w:type="dxa"/>
-            <w:tcBorders>
-              <w:top w:val="single" w:sz="4" w:space="0" w:color="000000"/>
-              <w:left w:val="single" w:sz="4" w:space="0" w:color="000000"/>
-              <w:bottom w:val="single" w:sz="4" w:space="0" w:color="000000"/>
-              <w:right w:val="single" w:sz="4" w:space="0" w:color="000000"/>
-            </w:tcBorders>
-            <w:tcMar>
-              <w:top w:w="100" w:type="dxa"/>
-              <w:left w:w="120" w:type="dxa"/>
-              <w:bottom w:w="100" w:type="dxa"/>
-              <w:right w:w="120" w:type="dxa"/>
-            </w:tcMar>
-            <w:vAlign w:val="center"/>
-          </w:tcPr>
-          <w:p>
-            <w:pPr>
-              <w:spacing w:after="120"/>
-              <w:jc w:val="center"/>
-            </w:pPr>
+              <w:t xml:space="preserve"> </w:t>
+            </w:r>
             <w:proofErr w:type="spellStart"/>
             <w:r>
               <w:rPr>
@@ -30323,16 +31130,68 @@
                 <w:bCs/>
                 <w:color w:val="000000"/>
               </w:rPr>
-              <w:t>Prioritas</w:t>
-            </w:r>
-            <w:proofErr w:type="spellEnd"/>
+              <w:t>Fitur</w:t>
+            </w:r>
+            <w:proofErr w:type="spellEnd"/>
+          </w:p>
+        </w:tc>
+        <w:tc>
+          <w:tcPr>
+            <w:tcW w:w="1989" w:type="dxa"/>
+            <w:tcBorders>
+              <w:top w:val="single" w:sz="4" w:space="0" w:color="000000"/>
+              <w:left w:val="single" w:sz="4" w:space="0" w:color="000000"/>
+              <w:bottom w:val="single" w:sz="4" w:space="0" w:color="000000"/>
+              <w:right w:val="single" w:sz="4" w:space="0" w:color="000000"/>
+            </w:tcBorders>
+            <w:tcMar>
+              <w:top w:w="100" w:type="dxa"/>
+              <w:left w:w="120" w:type="dxa"/>
+              <w:bottom w:w="100" w:type="dxa"/>
+              <w:right w:w="120" w:type="dxa"/>
+            </w:tcMar>
+            <w:vAlign w:val="center"/>
+          </w:tcPr>
+          <w:p>
+            <w:pPr>
+              <w:spacing w:after="120"/>
+              <w:jc w:val="center"/>
+            </w:pPr>
+            <w:proofErr w:type="spellStart"/>
             <w:r>
               <w:rPr>
                 <w:b/>
                 <w:bCs/>
                 <w:color w:val="000000"/>
               </w:rPr>
-              <w:t xml:space="preserve"> (Tinggi/Sedang/</w:t>
+              <w:t>Prioritas</w:t>
+            </w:r>
+            <w:proofErr w:type="spellEnd"/>
+            <w:r>
+              <w:rPr>
+                <w:b/>
+                <w:bCs/>
+                <w:color w:val="000000"/>
+              </w:rPr>
+              <w:t xml:space="preserve"> (Tinggi/</w:t>
+            </w:r>
+            <w:proofErr w:type="spellStart"/>
+            <w:r>
+              <w:rPr>
+                <w:b/>
+                <w:bCs/>
+                <w:color w:val="000000"/>
+              </w:rPr>
+              <w:t>Sedang</w:t>
+            </w:r>
+            <w:proofErr w:type="spellEnd"/>
+            <w:r>
+              <w:rPr>
+                <w:b/>
+                <w:bCs/>
+                <w:color w:val="000000"/>
+              </w:rPr>
+              <w:t>/</w:t>
             </w:r>
             <w:proofErr w:type="spellStart"/>
             <w:r>
@@ -30692,7 +31551,15 @@
             </w:r>
             <w:proofErr w:type="spellEnd"/>
             <w:r>
-              <w:t xml:space="preserve">, hapus, </w:t>
+              <w:t xml:space="preserve">, </w:t>
+            </w:r>
+            <w:proofErr w:type="spellStart"/>
+            <w:r>
+              <w:t>hapus</w:t>
+            </w:r>
+            <w:proofErr w:type="spellEnd"/>
+            <w:r>
+              <w:t xml:space="preserve">, </w:t>
             </w:r>
             <w:proofErr w:type="spellStart"/>
             <w:r>
@@ -30923,7 +31790,6 @@
               <w:rPr>
                 <w:color w:val="000000"/>
               </w:rPr>
-              <w:lastRenderedPageBreak/>
               <w:t>4</w:t>
             </w:r>
           </w:p>
@@ -31639,7 +32505,25 @@
                 <w:bCs/>
                 <w:color w:val="000000"/>
               </w:rPr>
-              <w:t xml:space="preserve"> Ke-</w:t>
+              <w:t xml:space="preserve"> </w:t>
+            </w:r>
+            <w:proofErr w:type="spellStart"/>
+            <w:r>
+              <w:rPr>
+                <w:b/>
+                <w:bCs/>
+                <w:color w:val="000000"/>
+              </w:rPr>
+              <w:t>Ke</w:t>
+            </w:r>
+            <w:proofErr w:type="spellEnd"/>
+            <w:r>
+              <w:rPr>
+                <w:b/>
+                <w:bCs/>
+                <w:color w:val="000000"/>
+              </w:rPr>
+              <w:t>-</w:t>
             </w:r>
           </w:p>
         </w:tc>
@@ -32179,6 +33063,7 @@
               <w:spacing w:after="120"/>
             </w:pPr>
             <w:r>
+              <w:lastRenderedPageBreak/>
               <w:t>4</w:t>
             </w:r>
           </w:p>
@@ -32909,7 +33794,6 @@
         <w:pStyle w:val="Heading2"/>
       </w:pPr>
       <w:r>
-        <w:lastRenderedPageBreak/>
         <w:t xml:space="preserve">8.5 </w:t>
       </w:r>
       <w:proofErr w:type="spellStart"/>
@@ -33371,7 +34255,15 @@
             </w:r>
             <w:proofErr w:type="spellEnd"/>
             <w:r>
-              <w:t xml:space="preserve">, hapus, dan </w:t>
+              <w:t xml:space="preserve">, </w:t>
+            </w:r>
+            <w:proofErr w:type="spellStart"/>
+            <w:r>
+              <w:t>hapus</w:t>
+            </w:r>
+            <w:proofErr w:type="spellEnd"/>
+            <w:r>
+              <w:t xml:space="preserve">, dan </w:t>
             </w:r>
             <w:proofErr w:type="spellStart"/>
             <w:r>
@@ -33982,6 +34874,7 @@
         <w:pStyle w:val="Heading2"/>
       </w:pPr>
       <w:r>
+        <w:lastRenderedPageBreak/>
         <w:t xml:space="preserve">8.6 Target </w:t>
       </w:r>
       <w:proofErr w:type="spellStart"/>
@@ -34399,8 +35292,13 @@
             </w:r>
             <w:proofErr w:type="spellEnd"/>
             <w:r>
-              <w:t xml:space="preserve"> Fitur</w:t>
-            </w:r>
+              <w:t xml:space="preserve"> </w:t>
+            </w:r>
+            <w:proofErr w:type="spellStart"/>
+            <w:r>
+              <w:t>Fitur</w:t>
+            </w:r>
+            <w:proofErr w:type="spellEnd"/>
           </w:p>
         </w:tc>
         <w:tc>
@@ -34518,8 +35416,13 @@
             </w:r>
             <w:proofErr w:type="spellEnd"/>
             <w:r>
-              <w:t xml:space="preserve"> Fitur</w:t>
-            </w:r>
+              <w:t xml:space="preserve"> </w:t>
+            </w:r>
+            <w:proofErr w:type="spellStart"/>
+            <w:r>
+              <w:t>Fitur</w:t>
+            </w:r>
+            <w:proofErr w:type="spellEnd"/>
           </w:p>
         </w:tc>
         <w:tc>
@@ -35047,8 +35950,13 @@
             <w:vAlign w:val="center"/>
           </w:tcPr>
           <w:p>
-            <w:r>
-              <w:t xml:space="preserve">Akhir </w:t>
+            <w:proofErr w:type="spellStart"/>
+            <w:r>
+              <w:t>Akhir</w:t>
+            </w:r>
+            <w:proofErr w:type="spellEnd"/>
+            <w:r>
+              <w:t xml:space="preserve"> </w:t>
             </w:r>
             <w:proofErr w:type="spellStart"/>
             <w:r>
@@ -35092,8 +36000,8 @@
       </w:pPr>
     </w:p>
     <w:sectPr>
-      <w:headerReference w:type="default" r:id="rId13"/>
-      <w:footerReference w:type="default" r:id="rId14"/>
+      <w:headerReference w:type="default" r:id="rId14"/>
+      <w:footerReference w:type="default" r:id="rId15"/>
       <w:pgSz w:w="11906" w:h="16838"/>
       <w:pgMar w:top="1417" w:right="1417" w:bottom="1417" w:left="1417" w:header="708" w:footer="708" w:gutter="0"/>
       <w:pgNumType w:start="1"/>
@@ -35104,7 +36012,7 @@
 </file>
 
 <file path=word/endnotes.xml><?xml version="1.0" encoding="utf-8"?>
-<w:endnotes xmlns:wpc="http://schemas.microsoft.com/office/word/2010/wordprocessingCanvas" xmlns:cx="http://schemas.microsoft.com/office/drawing/2014/chartex" xmlns:cx1="http://schemas.microsoft.com/office/drawing/2015/9/8/chartex" xmlns:cx2="http://schemas.microsoft.com/office/drawing/2015/10/21/chartex" xmlns:cx3="http://schemas.microsoft.com/office/drawing/2016/5/9/chartex" xmlns:cx4="http://schemas.microsoft.com/office/drawing/2016/5/10/chartex" xmlns:cx5="http://schemas.microsoft.com/office/drawing/2016/5/11/chartex" xmlns:cx6="http://schemas.microsoft.com/office/drawing/2016/5/12/chartex" xmlns:cx7="http://schemas.microsoft.com/office/drawing/2016/5/13/chartex" xmlns:cx8="http://schemas.microsoft.com/office/drawing/2016/5/14/chartex" xmlns:mc="http://schemas.openxmlformats.org/markup-compatibility/2006" xmlns:aink="http://schemas.microsoft.com/office/drawing/2016/ink" xmlns:am3d="http://schemas.microsoft.com/office/drawing/2017/model3d" xmlns:o="urn:schemas-microsoft-com:office:office" xmlns:oel="http://schemas.microsoft.com/office/2019/extlst" xmlns:r="http://schemas.openxmlformats.org/officeDocument/2006/relationships" xmlns:m="http://schemas.openxmlformats.org/officeDocument/2006/math" xmlns:v="urn:schemas-microsoft-com:vml" xmlns:wp14="http://schemas.microsoft.com/office/word/2010/wordprocessingDrawing" xmlns:wp="http://schemas.openxmlformats.org/drawingml/2006/wordprocessingDrawing" xmlns:w10="urn:schemas-microsoft-com:office:word" xmlns:w="http://schemas.openxmlformats.org/wordprocessingml/2006/main" xmlns:w14="http://schemas.microsoft.com/office/word/2010/wordml" xmlns:w15="http://schemas.microsoft.com/office/word/2012/wordml" xmlns:w16cex="http://schemas.microsoft.com/office/word/2018/wordml/cex" xmlns:w16cid="http://schemas.microsoft.com/office/word/2016/wordml/cid" xmlns:w16="http://schemas.microsoft.com/office/word/2018/wordml" xmlns:w16du="http://schemas.microsoft.com/office/word/2023/wordml/word16du" xmlns:w16sdtdh="http://schemas.microsoft.com/office/word/2020/wordml/sdtdatahash" xmlns:w16sdtfl="http://schemas.microsoft.com/office/word/2024/wordml/sdtformatlock" xmlns:w16se="http://schemas.microsoft.com/office/word/2015/wordml/symex" xmlns:wpg="http://schemas.microsoft.com/office/word/2010/wordprocessingGroup" xmlns:wpi="http://schemas.microsoft.com/office/word/2010/wordprocessingInk" xmlns:wne="http://schemas.microsoft.com/office/word/2006/wordml" xmlns:wps="http://schemas.microsoft.com/office/word/2010/wordprocessingShape" mc:Ignorable="w14 w15 w16se w16cid w16 w16cex w16sdtdh w16sdtfl w16du wp14">
+<w:endnotes xmlns:wpc="http://schemas.microsoft.com/office/word/2010/wordprocessingCanvas" xmlns:cx="http://schemas.microsoft.com/office/drawing/2014/chartex" xmlns:cx1="http://schemas.microsoft.com/office/drawing/2015/9/8/chartex" xmlns:cx2="http://schemas.microsoft.com/office/drawing/2015/10/21/chartex" xmlns:cx3="http://schemas.microsoft.com/office/drawing/2016/5/9/chartex" xmlns:cx4="http://schemas.microsoft.com/office/drawing/2016/5/10/chartex" xmlns:cx5="http://schemas.microsoft.com/office/drawing/2016/5/11/chartex" xmlns:cx6="http://schemas.microsoft.com/office/drawing/2016/5/12/chartex" xmlns:cx7="http://schemas.microsoft.com/office/drawing/2016/5/13/chartex" xmlns:cx8="http://schemas.microsoft.com/office/drawing/2016/5/14/chartex" xmlns:mc="http://schemas.openxmlformats.org/markup-compatibility/2006" xmlns:aink="http://schemas.microsoft.com/office/drawing/2016/ink" xmlns:am3d="http://schemas.microsoft.com/office/drawing/2017/model3d" xmlns:o="urn:schemas-microsoft-com:office:office" xmlns:r="http://schemas.openxmlformats.org/officeDocument/2006/relationships" xmlns:m="http://schemas.openxmlformats.org/officeDocument/2006/math" xmlns:v="urn:schemas-microsoft-com:vml" xmlns:wp14="http://schemas.microsoft.com/office/word/2010/wordprocessingDrawing" xmlns:wp="http://schemas.openxmlformats.org/drawingml/2006/wordprocessingDrawing" xmlns:w10="urn:schemas-microsoft-com:office:word" xmlns:w="http://schemas.openxmlformats.org/wordprocessingml/2006/main" xmlns:w14="http://schemas.microsoft.com/office/word/2010/wordml" xmlns:w15="http://schemas.microsoft.com/office/word/2012/wordml" xmlns:w16cex="http://schemas.microsoft.com/office/word/2018/wordml/cex" xmlns:w16cid="http://schemas.microsoft.com/office/word/2016/wordml/cid" xmlns:w16="http://schemas.microsoft.com/office/word/2018/wordml" xmlns:w16se="http://schemas.microsoft.com/office/word/2015/wordml/symex" xmlns:wpg="http://schemas.microsoft.com/office/word/2010/wordprocessingGroup" xmlns:wpi="http://schemas.microsoft.com/office/word/2010/wordprocessingInk" xmlns:wne="http://schemas.microsoft.com/office/word/2006/wordml" xmlns:wps="http://schemas.microsoft.com/office/word/2010/wordprocessingShape" mc:Ignorable="w14 w15 w16se w16cid w16 w16cex wp14">
   <w:endnote w:type="separator" w:id="-1">
     <w:p>
       <w:pPr>
@@ -35129,7 +36037,7 @@
 </file>
 
 <file path=word/footer1.xml><?xml version="1.0" encoding="utf-8"?>
-<w:ftr xmlns:wpc="http://schemas.microsoft.com/office/word/2010/wordprocessingCanvas" xmlns:cx="http://schemas.microsoft.com/office/drawing/2014/chartex" xmlns:cx1="http://schemas.microsoft.com/office/drawing/2015/9/8/chartex" xmlns:cx2="http://schemas.microsoft.com/office/drawing/2015/10/21/chartex" xmlns:cx3="http://schemas.microsoft.com/office/drawing/2016/5/9/chartex" xmlns:cx4="http://schemas.microsoft.com/office/drawing/2016/5/10/chartex" xmlns:cx5="http://schemas.microsoft.com/office/drawing/2016/5/11/chartex" xmlns:cx6="http://schemas.microsoft.com/office/drawing/2016/5/12/chartex" xmlns:cx7="http://schemas.microsoft.com/office/drawing/2016/5/13/chartex" xmlns:cx8="http://schemas.microsoft.com/office/drawing/2016/5/14/chartex" xmlns:mc="http://schemas.openxmlformats.org/markup-compatibility/2006" xmlns:aink="http://schemas.microsoft.com/office/drawing/2016/ink" xmlns:am3d="http://schemas.microsoft.com/office/drawing/2017/model3d" xmlns:o="urn:schemas-microsoft-com:office:office" xmlns:oel="http://schemas.microsoft.com/office/2019/extlst" xmlns:r="http://schemas.openxmlformats.org/officeDocument/2006/relationships" xmlns:m="http://schemas.openxmlformats.org/officeDocument/2006/math" xmlns:v="urn:schemas-microsoft-com:vml" xmlns:wp14="http://schemas.microsoft.com/office/word/2010/wordprocessingDrawing" xmlns:wp="http://schemas.openxmlformats.org/drawingml/2006/wordprocessingDrawing" xmlns:w10="urn:schemas-microsoft-com:office:word" xmlns:w="http://schemas.openxmlformats.org/wordprocessingml/2006/main" xmlns:w14="http://schemas.microsoft.com/office/word/2010/wordml" xmlns:w15="http://schemas.microsoft.com/office/word/2012/wordml" xmlns:w16cex="http://schemas.microsoft.com/office/word/2018/wordml/cex" xmlns:w16cid="http://schemas.microsoft.com/office/word/2016/wordml/cid" xmlns:w16="http://schemas.microsoft.com/office/word/2018/wordml" xmlns:w16du="http://schemas.microsoft.com/office/word/2023/wordml/word16du" xmlns:w16sdtdh="http://schemas.microsoft.com/office/word/2020/wordml/sdtdatahash" xmlns:w16sdtfl="http://schemas.microsoft.com/office/word/2024/wordml/sdtformatlock" xmlns:w16se="http://schemas.microsoft.com/office/word/2015/wordml/symex" xmlns:wpg="http://schemas.microsoft.com/office/word/2010/wordprocessingGroup" xmlns:wpi="http://schemas.microsoft.com/office/word/2010/wordprocessingInk" xmlns:wne="http://schemas.microsoft.com/office/word/2006/wordml" xmlns:wps="http://schemas.microsoft.com/office/word/2010/wordprocessingShape" mc:Ignorable="w14 w15 w16se w16cid w16 w16cex w16sdtdh w16sdtfl w16du wp14">
+<w:ftr xmlns:wpc="http://schemas.microsoft.com/office/word/2010/wordprocessingCanvas" xmlns:cx="http://schemas.microsoft.com/office/drawing/2014/chartex" xmlns:cx1="http://schemas.microsoft.com/office/drawing/2015/9/8/chartex" xmlns:cx2="http://schemas.microsoft.com/office/drawing/2015/10/21/chartex" xmlns:cx3="http://schemas.microsoft.com/office/drawing/2016/5/9/chartex" xmlns:cx4="http://schemas.microsoft.com/office/drawing/2016/5/10/chartex" xmlns:cx5="http://schemas.microsoft.com/office/drawing/2016/5/11/chartex" xmlns:cx6="http://schemas.microsoft.com/office/drawing/2016/5/12/chartex" xmlns:cx7="http://schemas.microsoft.com/office/drawing/2016/5/13/chartex" xmlns:cx8="http://schemas.microsoft.com/office/drawing/2016/5/14/chartex" xmlns:mc="http://schemas.openxmlformats.org/markup-compatibility/2006" xmlns:aink="http://schemas.microsoft.com/office/drawing/2016/ink" xmlns:am3d="http://schemas.microsoft.com/office/drawing/2017/model3d" xmlns:o="urn:schemas-microsoft-com:office:office" xmlns:r="http://schemas.openxmlformats.org/officeDocument/2006/relationships" xmlns:m="http://schemas.openxmlformats.org/officeDocument/2006/math" xmlns:v="urn:schemas-microsoft-com:vml" xmlns:wp14="http://schemas.microsoft.com/office/word/2010/wordprocessingDrawing" xmlns:wp="http://schemas.openxmlformats.org/drawingml/2006/wordprocessingDrawing" xmlns:w10="urn:schemas-microsoft-com:office:word" xmlns:w="http://schemas.openxmlformats.org/wordprocessingml/2006/main" xmlns:w14="http://schemas.microsoft.com/office/word/2010/wordml" xmlns:w15="http://schemas.microsoft.com/office/word/2012/wordml" xmlns:w16cex="http://schemas.microsoft.com/office/word/2018/wordml/cex" xmlns:w16cid="http://schemas.microsoft.com/office/word/2016/wordml/cid" xmlns:w16="http://schemas.microsoft.com/office/word/2018/wordml" xmlns:w16se="http://schemas.microsoft.com/office/word/2015/wordml/symex" xmlns:wpg="http://schemas.microsoft.com/office/word/2010/wordprocessingGroup" xmlns:wpi="http://schemas.microsoft.com/office/word/2010/wordprocessingInk" xmlns:wne="http://schemas.microsoft.com/office/word/2006/wordml" xmlns:wps="http://schemas.microsoft.com/office/word/2010/wordprocessingShape" mc:Ignorable="w14 w15 w16se w16cid w16 w16cex wp14">
   <w:p>
     <w:pPr>
       <w:pBdr>
@@ -35137,13 +36045,23 @@
       </w:pBdr>
       <w:jc w:val="center"/>
     </w:pPr>
+    <w:proofErr w:type="spellStart"/>
     <w:r>
       <w:rPr>
         <w:color w:val="000000"/>
         <w:sz w:val="16"/>
         <w:szCs w:val="16"/>
       </w:rPr>
-      <w:t xml:space="preserve">Halaman </w:t>
+      <w:t>Halaman</w:t>
+    </w:r>
+    <w:proofErr w:type="spellEnd"/>
+    <w:r>
+      <w:rPr>
+        <w:color w:val="000000"/>
+        <w:sz w:val="16"/>
+        <w:szCs w:val="16"/>
+      </w:rPr>
+      <w:t xml:space="preserve"> </w:t>
     </w:r>
     <w:r>
       <w:rPr>
@@ -35258,7 +36176,7 @@
 </file>
 
 <file path=word/footnotes.xml><?xml version="1.0" encoding="utf-8"?>
-<w:footnotes xmlns:wpc="http://schemas.microsoft.com/office/word/2010/wordprocessingCanvas" xmlns:cx="http://schemas.microsoft.com/office/drawing/2014/chartex" xmlns:cx1="http://schemas.microsoft.com/office/drawing/2015/9/8/chartex" xmlns:cx2="http://schemas.microsoft.com/office/drawing/2015/10/21/chartex" xmlns:cx3="http://schemas.microsoft.com/office/drawing/2016/5/9/chartex" xmlns:cx4="http://schemas.microsoft.com/office/drawing/2016/5/10/chartex" xmlns:cx5="http://schemas.microsoft.com/office/drawing/2016/5/11/chartex" xmlns:cx6="http://schemas.microsoft.com/office/drawing/2016/5/12/chartex" xmlns:cx7="http://schemas.microsoft.com/office/drawing/2016/5/13/chartex" xmlns:cx8="http://schemas.microsoft.com/office/drawing/2016/5/14/chartex" xmlns:mc="http://schemas.openxmlformats.org/markup-compatibility/2006" xmlns:aink="http://schemas.microsoft.com/office/drawing/2016/ink" xmlns:am3d="http://schemas.microsoft.com/office/drawing/2017/model3d" xmlns:o="urn:schemas-microsoft-com:office:office" xmlns:oel="http://schemas.microsoft.com/office/2019/extlst" xmlns:r="http://schemas.openxmlformats.org/officeDocument/2006/relationships" xmlns:m="http://schemas.openxmlformats.org/officeDocument/2006/math" xmlns:v="urn:schemas-microsoft-com:vml" xmlns:wp14="http://schemas.microsoft.com/office/word/2010/wordprocessingDrawing" xmlns:wp="http://schemas.openxmlformats.org/drawingml/2006/wordprocessingDrawing" xmlns:w10="urn:schemas-microsoft-com:office:word" xmlns:w="http://schemas.openxmlformats.org/wordprocessingml/2006/main" xmlns:w14="http://schemas.microsoft.com/office/word/2010/wordml" xmlns:w15="http://schemas.microsoft.com/office/word/2012/wordml" xmlns:w16cex="http://schemas.microsoft.com/office/word/2018/wordml/cex" xmlns:w16cid="http://schemas.microsoft.com/office/word/2016/wordml/cid" xmlns:w16="http://schemas.microsoft.com/office/word/2018/wordml" xmlns:w16du="http://schemas.microsoft.com/office/word/2023/wordml/word16du" xmlns:w16sdtdh="http://schemas.microsoft.com/office/word/2020/wordml/sdtdatahash" xmlns:w16sdtfl="http://schemas.microsoft.com/office/word/2024/wordml/sdtformatlock" xmlns:w16se="http://schemas.microsoft.com/office/word/2015/wordml/symex" xmlns:wpg="http://schemas.microsoft.com/office/word/2010/wordprocessingGroup" xmlns:wpi="http://schemas.microsoft.com/office/word/2010/wordprocessingInk" xmlns:wne="http://schemas.microsoft.com/office/word/2006/wordml" xmlns:wps="http://schemas.microsoft.com/office/word/2010/wordprocessingShape" mc:Ignorable="w14 w15 w16se w16cid w16 w16cex w16sdtdh w16sdtfl w16du wp14">
+<w:footnotes xmlns:wpc="http://schemas.microsoft.com/office/word/2010/wordprocessingCanvas" xmlns:cx="http://schemas.microsoft.com/office/drawing/2014/chartex" xmlns:cx1="http://schemas.microsoft.com/office/drawing/2015/9/8/chartex" xmlns:cx2="http://schemas.microsoft.com/office/drawing/2015/10/21/chartex" xmlns:cx3="http://schemas.microsoft.com/office/drawing/2016/5/9/chartex" xmlns:cx4="http://schemas.microsoft.com/office/drawing/2016/5/10/chartex" xmlns:cx5="http://schemas.microsoft.com/office/drawing/2016/5/11/chartex" xmlns:cx6="http://schemas.microsoft.com/office/drawing/2016/5/12/chartex" xmlns:cx7="http://schemas.microsoft.com/office/drawing/2016/5/13/chartex" xmlns:cx8="http://schemas.microsoft.com/office/drawing/2016/5/14/chartex" xmlns:mc="http://schemas.openxmlformats.org/markup-compatibility/2006" xmlns:aink="http://schemas.microsoft.com/office/drawing/2016/ink" xmlns:am3d="http://schemas.microsoft.com/office/drawing/2017/model3d" xmlns:o="urn:schemas-microsoft-com:office:office" xmlns:r="http://schemas.openxmlformats.org/officeDocument/2006/relationships" xmlns:m="http://schemas.openxmlformats.org/officeDocument/2006/math" xmlns:v="urn:schemas-microsoft-com:vml" xmlns:wp14="http://schemas.microsoft.com/office/word/2010/wordprocessingDrawing" xmlns:wp="http://schemas.openxmlformats.org/drawingml/2006/wordprocessingDrawing" xmlns:w10="urn:schemas-microsoft-com:office:word" xmlns:w="http://schemas.openxmlformats.org/wordprocessingml/2006/main" xmlns:w14="http://schemas.microsoft.com/office/word/2010/wordml" xmlns:w15="http://schemas.microsoft.com/office/word/2012/wordml" xmlns:w16cex="http://schemas.microsoft.com/office/word/2018/wordml/cex" xmlns:w16cid="http://schemas.microsoft.com/office/word/2016/wordml/cid" xmlns:w16="http://schemas.microsoft.com/office/word/2018/wordml" xmlns:w16se="http://schemas.microsoft.com/office/word/2015/wordml/symex" xmlns:wpg="http://schemas.microsoft.com/office/word/2010/wordprocessingGroup" xmlns:wpi="http://schemas.microsoft.com/office/word/2010/wordprocessingInk" xmlns:wne="http://schemas.microsoft.com/office/word/2006/wordml" xmlns:wps="http://schemas.microsoft.com/office/word/2010/wordprocessingShape" mc:Ignorable="w14 w15 w16se w16cid w16 w16cex wp14">
   <w:footnote w:type="separator" w:id="-1">
     <w:p>
       <w:pPr>
@@ -35283,7 +36201,7 @@
 </file>
 
 <file path=word/header1.xml><?xml version="1.0" encoding="utf-8"?>
-<w:hdr xmlns:wpc="http://schemas.microsoft.com/office/word/2010/wordprocessingCanvas" xmlns:cx="http://schemas.microsoft.com/office/drawing/2014/chartex" xmlns:cx1="http://schemas.microsoft.com/office/drawing/2015/9/8/chartex" xmlns:cx2="http://schemas.microsoft.com/office/drawing/2015/10/21/chartex" xmlns:cx3="http://schemas.microsoft.com/office/drawing/2016/5/9/chartex" xmlns:cx4="http://schemas.microsoft.com/office/drawing/2016/5/10/chartex" xmlns:cx5="http://schemas.microsoft.com/office/drawing/2016/5/11/chartex" xmlns:cx6="http://schemas.microsoft.com/office/drawing/2016/5/12/chartex" xmlns:cx7="http://schemas.microsoft.com/office/drawing/2016/5/13/chartex" xmlns:cx8="http://schemas.microsoft.com/office/drawing/2016/5/14/chartex" xmlns:mc="http://schemas.openxmlformats.org/markup-compatibility/2006" xmlns:aink="http://schemas.microsoft.com/office/drawing/2016/ink" xmlns:am3d="http://schemas.microsoft.com/office/drawing/2017/model3d" xmlns:o="urn:schemas-microsoft-com:office:office" xmlns:oel="http://schemas.microsoft.com/office/2019/extlst" xmlns:r="http://schemas.openxmlformats.org/officeDocument/2006/relationships" xmlns:m="http://schemas.openxmlformats.org/officeDocument/2006/math" xmlns:v="urn:schemas-microsoft-com:vml" xmlns:wp14="http://schemas.microsoft.com/office/word/2010/wordprocessingDrawing" xmlns:wp="http://schemas.openxmlformats.org/drawingml/2006/wordprocessingDrawing" xmlns:w10="urn:schemas-microsoft-com:office:word" xmlns:w="http://schemas.openxmlformats.org/wordprocessingml/2006/main" xmlns:w14="http://schemas.microsoft.com/office/word/2010/wordml" xmlns:w15="http://schemas.microsoft.com/office/word/2012/wordml" xmlns:w16cex="http://schemas.microsoft.com/office/word/2018/wordml/cex" xmlns:w16cid="http://schemas.microsoft.com/office/word/2016/wordml/cid" xmlns:w16="http://schemas.microsoft.com/office/word/2018/wordml" xmlns:w16du="http://schemas.microsoft.com/office/word/2023/wordml/word16du" xmlns:w16sdtdh="http://schemas.microsoft.com/office/word/2020/wordml/sdtdatahash" xmlns:w16sdtfl="http://schemas.microsoft.com/office/word/2024/wordml/sdtformatlock" xmlns:w16se="http://schemas.microsoft.com/office/word/2015/wordml/symex" xmlns:wpg="http://schemas.microsoft.com/office/word/2010/wordprocessingGroup" xmlns:wpi="http://schemas.microsoft.com/office/word/2010/wordprocessingInk" xmlns:wne="http://schemas.microsoft.com/office/word/2006/wordml" xmlns:wps="http://schemas.microsoft.com/office/word/2010/wordprocessingShape" mc:Ignorable="w14 w15 w16se w16cid w16 w16cex w16sdtdh w16sdtfl w16du wp14">
+<w:hdr xmlns:wpc="http://schemas.microsoft.com/office/word/2010/wordprocessingCanvas" xmlns:cx="http://schemas.microsoft.com/office/drawing/2014/chartex" xmlns:cx1="http://schemas.microsoft.com/office/drawing/2015/9/8/chartex" xmlns:cx2="http://schemas.microsoft.com/office/drawing/2015/10/21/chartex" xmlns:cx3="http://schemas.microsoft.com/office/drawing/2016/5/9/chartex" xmlns:cx4="http://schemas.microsoft.com/office/drawing/2016/5/10/chartex" xmlns:cx5="http://schemas.microsoft.com/office/drawing/2016/5/11/chartex" xmlns:cx6="http://schemas.microsoft.com/office/drawing/2016/5/12/chartex" xmlns:cx7="http://schemas.microsoft.com/office/drawing/2016/5/13/chartex" xmlns:cx8="http://schemas.microsoft.com/office/drawing/2016/5/14/chartex" xmlns:mc="http://schemas.openxmlformats.org/markup-compatibility/2006" xmlns:aink="http://schemas.microsoft.com/office/drawing/2016/ink" xmlns:am3d="http://schemas.microsoft.com/office/drawing/2017/model3d" xmlns:o="urn:schemas-microsoft-com:office:office" xmlns:r="http://schemas.openxmlformats.org/officeDocument/2006/relationships" xmlns:m="http://schemas.openxmlformats.org/officeDocument/2006/math" xmlns:v="urn:schemas-microsoft-com:vml" xmlns:wp14="http://schemas.microsoft.com/office/word/2010/wordprocessingDrawing" xmlns:wp="http://schemas.openxmlformats.org/drawingml/2006/wordprocessingDrawing" xmlns:w10="urn:schemas-microsoft-com:office:word" xmlns:w="http://schemas.openxmlformats.org/wordprocessingml/2006/main" xmlns:w14="http://schemas.microsoft.com/office/word/2010/wordml" xmlns:w15="http://schemas.microsoft.com/office/word/2012/wordml" xmlns:w16cex="http://schemas.microsoft.com/office/word/2018/wordml/cex" xmlns:w16cid="http://schemas.microsoft.com/office/word/2016/wordml/cid" xmlns:w16="http://schemas.microsoft.com/office/word/2018/wordml" xmlns:w16se="http://schemas.microsoft.com/office/word/2015/wordml/symex" xmlns:wpg="http://schemas.microsoft.com/office/word/2010/wordprocessingGroup" xmlns:wpi="http://schemas.microsoft.com/office/word/2010/wordprocessingInk" xmlns:wne="http://schemas.microsoft.com/office/word/2006/wordml" xmlns:wps="http://schemas.microsoft.com/office/word/2010/wordprocessingShape" mc:Ignorable="w14 w15 w16se w16cid w16 w16cex wp14">
   <w:p>
     <w:pPr>
       <w:pBdr>
@@ -35304,7 +36222,7 @@
 </file>
 
 <file path=word/numbering.xml><?xml version="1.0" encoding="utf-8"?>
-<w:numbering xmlns:wpc="http://schemas.microsoft.com/office/word/2010/wordprocessingCanvas" xmlns:cx="http://schemas.microsoft.com/office/drawing/2014/chartex" xmlns:cx1="http://schemas.microsoft.com/office/drawing/2015/9/8/chartex" xmlns:cx2="http://schemas.microsoft.com/office/drawing/2015/10/21/chartex" xmlns:cx3="http://schemas.microsoft.com/office/drawing/2016/5/9/chartex" xmlns:cx4="http://schemas.microsoft.com/office/drawing/2016/5/10/chartex" xmlns:cx5="http://schemas.microsoft.com/office/drawing/2016/5/11/chartex" xmlns:cx6="http://schemas.microsoft.com/office/drawing/2016/5/12/chartex" xmlns:cx7="http://schemas.microsoft.com/office/drawing/2016/5/13/chartex" xmlns:cx8="http://schemas.microsoft.com/office/drawing/2016/5/14/chartex" xmlns:mc="http://schemas.openxmlformats.org/markup-compatibility/2006" xmlns:aink="http://schemas.microsoft.com/office/drawing/2016/ink" xmlns:am3d="http://schemas.microsoft.com/office/drawing/2017/model3d" xmlns:o="urn:schemas-microsoft-com:office:office" xmlns:oel="http://schemas.microsoft.com/office/2019/extlst" xmlns:r="http://schemas.openxmlformats.org/officeDocument/2006/relationships" xmlns:m="http://schemas.openxmlformats.org/officeDocument/2006/math" xmlns:v="urn:schemas-microsoft-com:vml" xmlns:wp14="http://schemas.microsoft.com/office/word/2010/wordprocessingDrawing" xmlns:wp="http://schemas.openxmlformats.org/drawingml/2006/wordprocessingDrawing" xmlns:w10="urn:schemas-microsoft-com:office:word" xmlns:w="http://schemas.openxmlformats.org/wordprocessingml/2006/main" xmlns:w14="http://schemas.microsoft.com/office/word/2010/wordml" xmlns:w15="http://schemas.microsoft.com/office/word/2012/wordml" xmlns:w16cex="http://schemas.microsoft.com/office/word/2018/wordml/cex" xmlns:w16cid="http://schemas.microsoft.com/office/word/2016/wordml/cid" xmlns:w16="http://schemas.microsoft.com/office/word/2018/wordml" xmlns:w16du="http://schemas.microsoft.com/office/word/2023/wordml/word16du" xmlns:w16sdtdh="http://schemas.microsoft.com/office/word/2020/wordml/sdtdatahash" xmlns:w16sdtfl="http://schemas.microsoft.com/office/word/2024/wordml/sdtformatlock" xmlns:w16se="http://schemas.microsoft.com/office/word/2015/wordml/symex" xmlns:wpg="http://schemas.microsoft.com/office/word/2010/wordprocessingGroup" xmlns:wpi="http://schemas.microsoft.com/office/word/2010/wordprocessingInk" xmlns:wne="http://schemas.microsoft.com/office/word/2006/wordml" xmlns:wps="http://schemas.microsoft.com/office/word/2010/wordprocessingShape" mc:Ignorable="w14 w15 w16se w16cid w16 w16cex w16sdtdh w16sdtfl w16du wp14">
+<w:numbering xmlns:wpc="http://schemas.microsoft.com/office/word/2010/wordprocessingCanvas" xmlns:cx="http://schemas.microsoft.com/office/drawing/2014/chartex" xmlns:cx1="http://schemas.microsoft.com/office/drawing/2015/9/8/chartex" xmlns:cx2="http://schemas.microsoft.com/office/drawing/2015/10/21/chartex" xmlns:cx3="http://schemas.microsoft.com/office/drawing/2016/5/9/chartex" xmlns:cx4="http://schemas.microsoft.com/office/drawing/2016/5/10/chartex" xmlns:cx5="http://schemas.microsoft.com/office/drawing/2016/5/11/chartex" xmlns:cx6="http://schemas.microsoft.com/office/drawing/2016/5/12/chartex" xmlns:cx7="http://schemas.microsoft.com/office/drawing/2016/5/13/chartex" xmlns:cx8="http://schemas.microsoft.com/office/drawing/2016/5/14/chartex" xmlns:mc="http://schemas.openxmlformats.org/markup-compatibility/2006" xmlns:aink="http://schemas.microsoft.com/office/drawing/2016/ink" xmlns:am3d="http://schemas.microsoft.com/office/drawing/2017/model3d" xmlns:o="urn:schemas-microsoft-com:office:office" xmlns:r="http://schemas.openxmlformats.org/officeDocument/2006/relationships" xmlns:m="http://schemas.openxmlformats.org/officeDocument/2006/math" xmlns:v="urn:schemas-microsoft-com:vml" xmlns:wp14="http://schemas.microsoft.com/office/word/2010/wordprocessingDrawing" xmlns:wp="http://schemas.openxmlformats.org/drawingml/2006/wordprocessingDrawing" xmlns:w10="urn:schemas-microsoft-com:office:word" xmlns:w="http://schemas.openxmlformats.org/wordprocessingml/2006/main" xmlns:w14="http://schemas.microsoft.com/office/word/2010/wordml" xmlns:w15="http://schemas.microsoft.com/office/word/2012/wordml" xmlns:w16cex="http://schemas.microsoft.com/office/word/2018/wordml/cex" xmlns:w16cid="http://schemas.microsoft.com/office/word/2016/wordml/cid" xmlns:w16="http://schemas.microsoft.com/office/word/2018/wordml" xmlns:w16se="http://schemas.microsoft.com/office/word/2015/wordml/symex" xmlns:wpg="http://schemas.microsoft.com/office/word/2010/wordprocessingGroup" xmlns:wpi="http://schemas.microsoft.com/office/word/2010/wordprocessingInk" xmlns:wne="http://schemas.microsoft.com/office/word/2006/wordml" xmlns:wps="http://schemas.microsoft.com/office/word/2010/wordprocessingShape" mc:Ignorable="w14 w15 w16se w16cid w16 w16cex wp14">
   <w:abstractNum w:abstractNumId="0" w15:restartNumberingAfterBreak="0">
     <w:nsid w:val="18C042F2"/>
     <w:multiLevelType w:val="multilevel"/>
@@ -35454,14 +36372,14 @@
       </w:rPr>
     </w:lvl>
   </w:abstractNum>
-  <w:num w:numId="1" w16cid:durableId="1431898896">
+  <w:num w:numId="1">
     <w:abstractNumId w:val="0"/>
   </w:num>
 </w:numbering>
 </file>
 
 <file path=word/styles.xml><?xml version="1.0" encoding="utf-8"?>
-<w:styles xmlns:mc="http://schemas.openxmlformats.org/markup-compatibility/2006" xmlns:r="http://schemas.openxmlformats.org/officeDocument/2006/relationships" xmlns:w="http://schemas.openxmlformats.org/wordprocessingml/2006/main" xmlns:w14="http://schemas.microsoft.com/office/word/2010/wordml" xmlns:w15="http://schemas.microsoft.com/office/word/2012/wordml" xmlns:w16cex="http://schemas.microsoft.com/office/word/2018/wordml/cex" xmlns:w16cid="http://schemas.microsoft.com/office/word/2016/wordml/cid" xmlns:w16="http://schemas.microsoft.com/office/word/2018/wordml" xmlns:w16du="http://schemas.microsoft.com/office/word/2023/wordml/word16du" xmlns:w16sdtdh="http://schemas.microsoft.com/office/word/2020/wordml/sdtdatahash" xmlns:w16sdtfl="http://schemas.microsoft.com/office/word/2024/wordml/sdtformatlock" xmlns:w16se="http://schemas.microsoft.com/office/word/2015/wordml/symex" mc:Ignorable="w14 w15 w16se w16cid w16 w16cex w16sdtdh w16sdtfl w16du">
+<w:styles xmlns:mc="http://schemas.openxmlformats.org/markup-compatibility/2006" xmlns:r="http://schemas.openxmlformats.org/officeDocument/2006/relationships" xmlns:w="http://schemas.openxmlformats.org/wordprocessingml/2006/main" xmlns:w14="http://schemas.microsoft.com/office/word/2010/wordml" xmlns:w15="http://schemas.microsoft.com/office/word/2012/wordml" xmlns:w16cex="http://schemas.microsoft.com/office/word/2018/wordml/cex" xmlns:w16cid="http://schemas.microsoft.com/office/word/2016/wordml/cid" xmlns:w16="http://schemas.microsoft.com/office/word/2018/wordml" xmlns:w16se="http://schemas.microsoft.com/office/word/2015/wordml/symex" mc:Ignorable="w14 w15 w16se w16cid w16 w16cex">
   <w:docDefaults>
     <w:rPrDefault>
       <w:rPr>
@@ -37005,6 +37923,10 @@
 </go:gDocsCustomXmlDataStorage>
 </file>
 
+<file path=customXml/item2.xml><?xml version="1.0" encoding="utf-8"?>
+<b:Sources xmlns:b="http://schemas.openxmlformats.org/officeDocument/2006/bibliography" xmlns="http://schemas.openxmlformats.org/officeDocument/2006/bibliography" SelectedStyle="\APASixthEditionOfficeOnline.xsl" StyleName="APA" Version="6"/>
+</file>
+
 <file path=customXml/itemProps1.xml><?xml version="1.0" encoding="utf-8"?>
 <ds:datastoreItem xmlns:ds="http://schemas.openxmlformats.org/officeDocument/2006/customXml" ds:itemID="{11111111-1234-1234-1234-123412341234}">
   <ds:schemaRefs>
@@ -37012,4 +37934,12 @@
     <ds:schemaRef ds:uri="http://schemas.openxmlformats.org/officeDocument/2006/relationships"/>
   </ds:schemaRefs>
 </ds:datastoreItem>
+</file>
+
+<file path=customXml/itemProps2.xml><?xml version="1.0" encoding="utf-8"?>
+<ds:datastoreItem xmlns:ds="http://schemas.openxmlformats.org/officeDocument/2006/customXml" ds:itemID="{8EE2983C-E857-4258-B030-BAAACBE7B2DB}">
+  <ds:schemaRefs>
+    <ds:schemaRef ds:uri="http://schemas.openxmlformats.org/officeDocument/2006/bibliography"/>
+  </ds:schemaRefs>
+</ds:datastoreItem>
 </file>
</xml_diff>